<commit_message>
Add step-by-step illustrated teaching solutions and question 4 guide
</commit_message>
<xml_diff>
--- a/materials/grade8_selected/selected_teacher.docx
+++ b/materials/grade8_selected/selected_teacher.docx
@@ -7,33 +7,12 @@
         <w:pStyle w:val="Title"/>
       </w:pPr>
       <w:r>
-        <w:t>如何用这套现有题做两小时诊断</w:t>
-      </w:r>
-    </w:p>
-    <w:p>
-      <w:pPr>
-        <w:pStyle w:val="Heading2"/>
-      </w:pPr>
-      <w:r>
-        <w:t>选题目的</w:t>
+        <w:t>逐步配图教师答案与两小时教案</w:t>
       </w:r>
     </w:p>
     <w:p>
       <w:r>
-        <w:t>针对原卷选择第10题、填空第16题及第24、25题的失分，主要检测旋转后的长度转移、中点辅助线、位置变化时的分类，以及最值的取等条件。题目选自现成资料，保留原条件、数值和原图；60分评分、时间、作答要求及以下讲解为本次编排。</w:t>
-      </w:r>
-    </w:p>
-    <w:p>
-      <w:pPr>
-        <w:pStyle w:val="Heading2"/>
-      </w:pPr>
-      <w:r>
-        <w:t>难度与进度</w:t>
-      </w:r>
-    </w:p>
-    <w:p>
-      <w:r>
-        <w:t>这是一套提高诊断卷，不是基础题检测。第1题需要把三段长度转成一条折线；第2题需要主动补一个固定等边三角形；第3题需两次全等并在延长线位置重新判断加减；第4题需连接中点性质、旋转和面积。不要把“中考题”标签当作难度保证，重在是否独立完成这些方法链。</w:t>
+        <w:t>每一步均配数学图、作图指令、分条证明与本步结论。原题条件不变；教学图不按数值比例绘制。</w:t>
       </w:r>
     </w:p>
     <w:p>
@@ -46,7 +25,7 @@
     </w:p>
     <w:p>
       <w:r>
-        <w:t>只用全等、角关系、等边三角形、平行线、三角形不等式与面积公式完成主要推理。正方形只需四边相等、四角直角。中点连线性质若尚未学习，可用第6页的两次SAS证明；记录为先备知识缺口，不直接判断为思维薄弱。第1题的根式数值另需勾股定理，不计本次评分。</w:t>
+        <w:t>只用全等、角关系、等边三角形、平行线、三角形不等式与面积公式完成主要推理。正方形只需四边相等、四角直角。中点连线性质若尚未学习，可用附录的两次SAS证明；记录为先备知识缺口，不直接判断为思维薄弱。第1题的根式数值另需勾股定理，不计本次评分。</w:t>
       </w:r>
     </w:p>
     <w:p>
@@ -76,16 +55,81 @@
       </w:r>
     </w:p>
     <w:p>
+      <w:r>
+        <w:br w:type="page"/>
+      </w:r>
+    </w:p>
+    <w:p>
       <w:pPr>
-        <w:pStyle w:val="Heading2"/>
+        <w:pStyle w:val="Title"/>
       </w:pPr>
       <w:r>
-        <w:t>使用边界</w:t>
+        <w:t>第1题：旋转与三段距离最小值</w:t>
+      </w:r>
+    </w:p>
+    <w:p>
+      <w:pPr>
+        <w:pStyle w:val="Heading1"/>
+      </w:pPr>
+      <w:r>
+        <w:t>第1步：把AM换成EN</w:t>
       </w:r>
     </w:p>
     <w:p>
       <w:r>
-        <w:t>原卷已被学校讲评，做过同型题不等于掌握。这次优先观察辅助线是否自己想到、夹角能否说明，以及最值能否证明取得。50分钟结束可保留未完成，不用把60分线性换算成150分预测成绩。</w:t>
+        <w:t>作图：连EN，突出△ABM和△EBN。</w:t>
+      </w:r>
+    </w:p>
+    <w:p>
+      <w:r>
+        <w:drawing>
+          <wp:inline xmlns:a="http://schemas.openxmlformats.org/drawingml/2006/main" xmlns:pic="http://schemas.openxmlformats.org/drawingml/2006/picture">
+            <wp:extent cx="3780000" cy="3198462"/>
+            <wp:docPr id="1" name="Picture 1"/>
+            <wp:cNvGraphicFramePr>
+              <a:graphicFrameLocks noChangeAspect="1"/>
+            </wp:cNvGraphicFramePr>
+            <a:graphic>
+              <a:graphicData uri="http://schemas.openxmlformats.org/drawingml/2006/picture">
+                <pic:pic>
+                  <pic:nvPicPr>
+                    <pic:cNvPr id="0" name="q1sas.png"/>
+                    <pic:cNvPicPr/>
+                  </pic:nvPicPr>
+                  <pic:blipFill>
+                    <a:blip r:embed="rId10"/>
+                    <a:stretch>
+                      <a:fillRect/>
+                    </a:stretch>
+                  </pic:blipFill>
+                  <pic:spPr>
+                    <a:xfrm>
+                      <a:off x="0" y="0"/>
+                      <a:ext cx="3780000" cy="3198462"/>
+                    </a:xfrm>
+                    <a:prstGeom prst="rect"/>
+                  </pic:spPr>
+                </pic:pic>
+              </a:graphicData>
+            </a:graphic>
+          </wp:inline>
+        </w:drawing>
+      </w:r>
+    </w:p>
+    <w:p>
+      <w:r>
+        <w:t>①BA=BE（等边△ABE）。</w:t>
+        <w:br/>
+        <w:t>②BM=BN（旋转得到）。</w:t>
+        <w:br/>
+        <w:t>③∠ABM=∠EBN=45°。</w:t>
+        <w:br/>
+        <w:t>所以△ABM≌△EBN（SAS）。对应顶点是A与E、B与B、M与N。</w:t>
+      </w:r>
+    </w:p>
+    <w:p>
+      <w:r>
+        <w:t>本步结论：对应边：AM=EN。</w:t>
       </w:r>
     </w:p>
     <w:p>
@@ -98,85 +142,72 @@
         <w:pStyle w:val="Title"/>
       </w:pPr>
       <w:r>
-        <w:t>第1题：三段距离变成一条折线</w:t>
+        <w:t>第1题：旋转与三段距离最小值</w:t>
       </w:r>
     </w:p>
     <w:p>
       <w:pPr>
-        <w:pStyle w:val="Heading2"/>
+        <w:pStyle w:val="Heading1"/>
       </w:pPr>
       <w:r>
-        <w:t>答案</w:t>
+        <w:t>第2步：把BM换成MN</w:t>
       </w:r>
     </w:p>
     <w:p>
       <w:r>
-        <w:t>最小值为CE，数值为√6+√2。M取直线EC与对角线BD的交点；这是BD内部的点。主要评分只要求以CE表示，并证明下界能够取得。</w:t>
-      </w:r>
-    </w:p>
-    <w:p>
-      <w:pPr>
-        <w:pStyle w:val="Heading2"/>
-      </w:pPr>
-      <w:r>
-        <w:t>把AM搬到EN</w:t>
+        <w:t>作图：连MN，单独看△BMN。</w:t>
       </w:r>
     </w:p>
     <w:p>
       <w:r>
-        <w:t>BA=BE，BM=BN，∠ABM=∠EBN=45°，所以△ABM≌△EBN（SAS），得AM=EN。由BM=BN、∠MBN=60°，△BMN为等边三角形，故BM=MN。当M=B时直接处理，三段和为4，大于最优值。</w:t>
-      </w:r>
-    </w:p>
-    <w:p>
-      <w:pPr>
-        <w:pStyle w:val="Heading2"/>
-      </w:pPr>
-      <w:r>
-        <w:t>固定下界与取等</w:t>
+        <w:drawing>
+          <wp:inline xmlns:a="http://schemas.openxmlformats.org/drawingml/2006/main" xmlns:pic="http://schemas.openxmlformats.org/drawingml/2006/picture">
+            <wp:extent cx="3780000" cy="3198462"/>
+            <wp:docPr id="2" name="Picture 2"/>
+            <wp:cNvGraphicFramePr>
+              <a:graphicFrameLocks noChangeAspect="1"/>
+            </wp:cNvGraphicFramePr>
+            <a:graphic>
+              <a:graphicData uri="http://schemas.openxmlformats.org/drawingml/2006/picture">
+                <pic:pic>
+                  <pic:nvPicPr>
+                    <pic:cNvPr id="0" name="q1equilateral.png"/>
+                    <pic:cNvPicPr/>
+                  </pic:nvPicPr>
+                  <pic:blipFill>
+                    <a:blip r:embed="rId11"/>
+                    <a:stretch>
+                      <a:fillRect/>
+                    </a:stretch>
+                  </pic:blipFill>
+                  <pic:spPr>
+                    <a:xfrm>
+                      <a:off x="0" y="0"/>
+                      <a:ext cx="3780000" cy="3198462"/>
+                    </a:xfrm>
+                    <a:prstGeom prst="rect"/>
+                  </pic:spPr>
+                </pic:pic>
+              </a:graphicData>
+            </a:graphic>
+          </wp:inline>
+        </w:drawing>
       </w:r>
     </w:p>
     <w:p>
       <w:r>
-        <w:t>当M≠B时，AM+BM+CM=EN+NM+MC≥EC。等号要求E、N、M、C在同一直线上，且按此顺序排列，不能只写一个三角形不等式就结束。</w:t>
-      </w:r>
-    </w:p>
-    <w:p>
-      <w:pPr>
-        <w:pStyle w:val="Heading2"/>
-      </w:pPr>
-      <w:r>
-        <w:t>为什么这样的M合法</w:t>
+        <w:t>①BM=BN。</w:t>
+        <w:br/>
+        <w:t>②∠MBN=60°。</w:t>
+        <w:br/>
+        <w:t>等腰三角形的两个底角均为(180°-60°)/2=60°。</w:t>
+        <w:br/>
+        <w:t>因此△BMN是等边三角形。</w:t>
       </w:r>
     </w:p>
     <w:p>
       <w:r>
-        <w:t>在等腰△EBC中，BE=BC=2，∠EBC=150°，所以∠ECB=15°。又BD与BC夹45°，而等边△BMN使MN与BC夹15°，方向与EC相同，故MN∥EC。令M为EC与BD的交点，则MN所在直线就是EC。射线BE、BN、BM、BC在∠EBC内部依次排列，它们与线段EC的交点依次为E、N、M、C。EC与BD交在正方形内部，因而M在BD上，等号可取得。</w:t>
-      </w:r>
-    </w:p>
-    <w:p>
-      <w:pPr>
-        <w:pStyle w:val="Heading2"/>
-      </w:pPr>
-      <w:r>
-        <w:t>数值计算，按进度选讲</w:t>
-      </w:r>
-    </w:p>
-    <w:p>
-      <w:r>
-        <w:t>作EH⊥AB于H，H为AB中点，因此BH=1、EH=√3（这里使用勾股定理）。相对BC方向，E的垂直距离为1，水平方向到C的距离为2+√3，所以CE²=(2+√3)²+1=8+4√3，CE=√6+√2。未学勾股的学生停在“最小值为CE”即可。</w:t>
-      </w:r>
-    </w:p>
-    <w:p>
-      <w:pPr>
-        <w:pStyle w:val="Heading2"/>
-      </w:pPr>
-      <w:r>
-        <w:t>8分评分与提示</w:t>
-      </w:r>
-    </w:p>
-    <w:p>
-      <w:r>
-        <w:t>AM=EN的全等2分；BM=MN及折线转化2分；固定下界2分；合法取点、顺序及等号2分。提示顺序：①哪条长度能旋转到N附近？②BMN是什么三角形？③折线的端点是否固定？④等号时M落在哪里？记录提示等级。</w:t>
+        <w:t>本步结论：BM=MN；此时三段距离成为EN、NM、MC。</w:t>
       </w:r>
     </w:p>
     <w:p>
@@ -189,7 +220,2215 @@
         <w:pStyle w:val="Title"/>
       </w:pPr>
       <w:r>
-        <w:t>第2题：先补固定等边三角形</w:t>
+        <w:t>第1题：旋转与三段距离最小值</w:t>
+      </w:r>
+    </w:p>
+    <w:p>
+      <w:pPr>
+        <w:pStyle w:val="Heading1"/>
+      </w:pPr>
+      <w:r>
+        <w:t>第3步：把长度和写成折线路径</w:t>
+      </w:r>
+    </w:p>
+    <w:p>
+      <w:r>
+        <w:t>作图：蓝色虚线EC是固定线段；红色EN、NM、MC是折线。</w:t>
+      </w:r>
+    </w:p>
+    <w:p>
+      <w:r>
+        <w:drawing>
+          <wp:inline xmlns:a="http://schemas.openxmlformats.org/drawingml/2006/main" xmlns:pic="http://schemas.openxmlformats.org/drawingml/2006/picture">
+            <wp:extent cx="3780000" cy="3198462"/>
+            <wp:docPr id="3" name="Picture 3"/>
+            <wp:cNvGraphicFramePr>
+              <a:graphicFrameLocks noChangeAspect="1"/>
+            </wp:cNvGraphicFramePr>
+            <a:graphic>
+              <a:graphicData uri="http://schemas.openxmlformats.org/drawingml/2006/picture">
+                <pic:pic>
+                  <pic:nvPicPr>
+                    <pic:cNvPr id="0" name="q1path.png"/>
+                    <pic:cNvPicPr/>
+                  </pic:nvPicPr>
+                  <pic:blipFill>
+                    <a:blip r:embed="rId12"/>
+                    <a:stretch>
+                      <a:fillRect/>
+                    </a:stretch>
+                  </pic:blipFill>
+                  <pic:spPr>
+                    <a:xfrm>
+                      <a:off x="0" y="0"/>
+                      <a:ext cx="3780000" cy="3198462"/>
+                    </a:xfrm>
+                    <a:prstGeom prst="rect"/>
+                  </pic:spPr>
+                </pic:pic>
+              </a:graphicData>
+            </a:graphic>
+          </wp:inline>
+        </w:drawing>
+      </w:r>
+    </w:p>
+    <w:p>
+      <w:r>
+        <w:t>AM+BM+CM</w:t>
+        <w:br/>
+        <w:t>=EN+NM+MC</w:t>
+        <w:br/>
+        <w:t>≥EC。</w:t>
+        <w:br/>
+        <w:t>依据：两点之间线段最短。这里只找到了下界，还必须证明等号能取到。若M=B，三段和为4，且EC&lt;BE+BC=4。</w:t>
+      </w:r>
+    </w:p>
+    <w:p>
+      <w:r>
+        <w:t>本步结论：任何允许的M，都有AM+BM+CM≥EC。</w:t>
+      </w:r>
+    </w:p>
+    <w:p>
+      <w:r>
+        <w:br w:type="page"/>
+      </w:r>
+    </w:p>
+    <w:p>
+      <w:pPr>
+        <w:pStyle w:val="Title"/>
+      </w:pPr>
+      <w:r>
+        <w:t>第1题：旋转与三段距离最小值</w:t>
+      </w:r>
+    </w:p>
+    <w:p>
+      <w:pPr>
+        <w:pStyle w:val="Heading1"/>
+      </w:pPr>
+      <w:r>
+        <w:t>第4步：画出取得最小值的位置</w:t>
+      </w:r>
+    </w:p>
+    <w:p>
+      <w:r>
+        <w:t>作图：取M为EC与BD的交点，再得到N；补画AC确认取点范围。</w:t>
+      </w:r>
+    </w:p>
+    <w:p>
+      <w:r>
+        <w:drawing>
+          <wp:inline xmlns:a="http://schemas.openxmlformats.org/drawingml/2006/main" xmlns:pic="http://schemas.openxmlformats.org/drawingml/2006/picture">
+            <wp:extent cx="3780000" cy="3198462"/>
+            <wp:docPr id="4" name="Picture 4"/>
+            <wp:cNvGraphicFramePr>
+              <a:graphicFrameLocks noChangeAspect="1"/>
+            </wp:cNvGraphicFramePr>
+            <a:graphic>
+              <a:graphicData uri="http://schemas.openxmlformats.org/drawingml/2006/picture">
+                <pic:pic>
+                  <pic:nvPicPr>
+                    <pic:cNvPr id="0" name="q1equal.png"/>
+                    <pic:cNvPicPr/>
+                  </pic:nvPicPr>
+                  <pic:blipFill>
+                    <a:blip r:embed="rId13"/>
+                    <a:stretch>
+                      <a:fillRect/>
+                    </a:stretch>
+                  </pic:blipFill>
+                  <pic:spPr>
+                    <a:xfrm>
+                      <a:off x="0" y="0"/>
+                      <a:ext cx="3780000" cy="3198462"/>
+                    </a:xfrm>
+                    <a:prstGeom prst="rect"/>
+                  </pic:spPr>
+                </pic:pic>
+              </a:graphicData>
+            </a:graphic>
+          </wp:inline>
+        </w:drawing>
+      </w:r>
+    </w:p>
+    <w:p>
+      <w:r>
+        <w:t>BE=BC，∠EBC=150°，所以∠ECB=15°。</w:t>
+        <w:br/>
+        <w:t>∠BCA=45°，CE进入△ABC内部，故与BD相交于BD内部。</w:t>
+        <w:br/>
+        <w:t>BD与BC夹45°；由等边△BMN，MN与BC夹15°，所以MN∥EC。</w:t>
+        <w:br/>
+        <w:t>当M在EC上时，E、N、M、C依次共线，等号成立。</w:t>
+      </w:r>
+    </w:p>
+    <w:p>
+      <w:r>
+        <w:t>本步结论：等号可取得；最小值为CE，M=EC与BD的交点。</w:t>
+      </w:r>
+    </w:p>
+    <w:p>
+      <w:r>
+        <w:br w:type="page"/>
+      </w:r>
+    </w:p>
+    <w:p>
+      <w:pPr>
+        <w:pStyle w:val="Title"/>
+      </w:pPr>
+      <w:r>
+        <w:t>第1题：旋转与三段距离最小值</w:t>
+      </w:r>
+    </w:p>
+    <w:p>
+      <w:pPr>
+        <w:pStyle w:val="Heading1"/>
+      </w:pPr>
+      <w:r>
+        <w:t>第5步：数值计算（未学勾股可跳过）</w:t>
+      </w:r>
+    </w:p>
+    <w:p>
+      <w:r>
+        <w:t>作图：作EH⊥AB于H；作EK⊥BC所在直线于K。</w:t>
+      </w:r>
+    </w:p>
+    <w:p>
+      <w:r>
+        <w:drawing>
+          <wp:inline xmlns:a="http://schemas.openxmlformats.org/drawingml/2006/main" xmlns:pic="http://schemas.openxmlformats.org/drawingml/2006/picture">
+            <wp:extent cx="3780000" cy="3198462"/>
+            <wp:docPr id="5" name="Picture 5"/>
+            <wp:cNvGraphicFramePr>
+              <a:graphicFrameLocks noChangeAspect="1"/>
+            </wp:cNvGraphicFramePr>
+            <a:graphic>
+              <a:graphicData uri="http://schemas.openxmlformats.org/drawingml/2006/picture">
+                <pic:pic>
+                  <pic:nvPicPr>
+                    <pic:cNvPr id="0" name="q1number.png"/>
+                    <pic:cNvPicPr/>
+                  </pic:nvPicPr>
+                  <pic:blipFill>
+                    <a:blip r:embed="rId14"/>
+                    <a:stretch>
+                      <a:fillRect/>
+                    </a:stretch>
+                  </pic:blipFill>
+                  <pic:spPr>
+                    <a:xfrm>
+                      <a:off x="0" y="0"/>
+                      <a:ext cx="3780000" cy="3198462"/>
+                    </a:xfrm>
+                    <a:prstGeom prst="rect"/>
+                  </pic:spPr>
+                </pic:pic>
+              </a:graphicData>
+            </a:graphic>
+          </wp:inline>
+        </w:drawing>
+      </w:r>
+    </w:p>
+    <w:p>
+      <w:r>
+        <w:t>等边△ABE边长2，H为AB中点，所以BH=1。</w:t>
+        <w:br/>
+        <w:t>EH²=2²-1²=3，EH=√3。</w:t>
+        <w:br/>
+        <w:t>EK=BH=1，KC=KB+BC=√3+2。</w:t>
+        <w:br/>
+        <w:t>CE²=EK²+KC²=8+4√3。</w:t>
+      </w:r>
+    </w:p>
+    <w:p>
+      <w:r>
+        <w:t>本步结论：CE=√6+√2。主要诊断评分可只要求“最小值为CE”。</w:t>
+      </w:r>
+    </w:p>
+    <w:p>
+      <w:r>
+        <w:br w:type="page"/>
+      </w:r>
+    </w:p>
+    <w:p>
+      <w:pPr>
+        <w:pStyle w:val="Title"/>
+      </w:pPr>
+      <w:r>
+        <w:t>第2题：等边动点与中点轨迹</w:t>
+      </w:r>
+    </w:p>
+    <w:p>
+      <w:pPr>
+        <w:pStyle w:val="Heading1"/>
+      </w:pPr>
+      <w:r>
+        <w:t>第1步：补一个不会动的等边三角形</w:t>
+      </w:r>
+    </w:p>
+    <w:p>
+      <w:r>
+        <w:t>作图：在AB同侧作等边△ABQ，Q是固定点；连QP。</w:t>
+      </w:r>
+    </w:p>
+    <w:p>
+      <w:r>
+        <w:drawing>
+          <wp:inline xmlns:a="http://schemas.openxmlformats.org/drawingml/2006/main" xmlns:pic="http://schemas.openxmlformats.org/drawingml/2006/picture">
+            <wp:extent cx="3780000" cy="3198462"/>
+            <wp:docPr id="6" name="Picture 6"/>
+            <wp:cNvGraphicFramePr>
+              <a:graphicFrameLocks noChangeAspect="1"/>
+            </wp:cNvGraphicFramePr>
+            <a:graphic>
+              <a:graphicData uri="http://schemas.openxmlformats.org/drawingml/2006/picture">
+                <pic:pic>
+                  <pic:nvPicPr>
+                    <pic:cNvPr id="0" name="q2add.png"/>
+                    <pic:cNvPicPr/>
+                  </pic:nvPicPr>
+                  <pic:blipFill>
+                    <a:blip r:embed="rId15"/>
+                    <a:stretch>
+                      <a:fillRect/>
+                    </a:stretch>
+                  </pic:blipFill>
+                  <pic:spPr>
+                    <a:xfrm>
+                      <a:off x="0" y="0"/>
+                      <a:ext cx="3780000" cy="3198462"/>
+                    </a:xfrm>
+                    <a:prstGeom prst="rect"/>
+                  </pic:spPr>
+                </pic:pic>
+              </a:graphicData>
+            </a:graphic>
+          </wp:inline>
+        </w:drawing>
+      </w:r>
+    </w:p>
+    <w:p>
+      <w:r>
+        <w:t>∠EAP=∠QAB=60°，所以A、E、Q共线。</w:t>
+        <w:br/>
+        <w:t>同理B、F、Q共线。</w:t>
+        <w:br/>
+        <w:t>E、F随P运动，但Q不动。</w:t>
+        <w:br/>
+        <w:t>后面要把M的运动转化成“固定点Q与动点P之间的中点运动”。</w:t>
+      </w:r>
+    </w:p>
+    <w:p>
+      <w:r>
+        <w:t>本步结论：固定辅助点：Q；E在AQ上，F在BQ上。</w:t>
+      </w:r>
+    </w:p>
+    <w:p>
+      <w:r>
+        <w:br w:type="page"/>
+      </w:r>
+    </w:p>
+    <w:p>
+      <w:pPr>
+        <w:pStyle w:val="Title"/>
+      </w:pPr>
+      <w:r>
+        <w:t>第2题：等边动点与中点轨迹</w:t>
+      </w:r>
+    </w:p>
+    <w:p>
+      <w:pPr>
+        <w:pStyle w:val="Heading1"/>
+      </w:pPr>
+      <w:r>
+        <w:t>第2步：找到一组等长且平行的边</w:t>
+      </w:r>
+    </w:p>
+    <w:p>
+      <w:r>
+        <w:t>作图：突出EP和FQ；二者都沿等边三角形的同一边方向。</w:t>
+      </w:r>
+    </w:p>
+    <w:p>
+      <w:r>
+        <w:drawing>
+          <wp:inline xmlns:a="http://schemas.openxmlformats.org/drawingml/2006/main" xmlns:pic="http://schemas.openxmlformats.org/drawingml/2006/picture">
+            <wp:extent cx="3780000" cy="3198462"/>
+            <wp:docPr id="7" name="Picture 7"/>
+            <wp:cNvGraphicFramePr>
+              <a:graphicFrameLocks noChangeAspect="1"/>
+            </wp:cNvGraphicFramePr>
+            <a:graphic>
+              <a:graphicData uri="http://schemas.openxmlformats.org/drawingml/2006/picture">
+                <pic:pic>
+                  <pic:nvPicPr>
+                    <pic:cNvPr id="0" name="q2sides.png"/>
+                    <pic:cNvPicPr/>
+                  </pic:nvPicPr>
+                  <pic:blipFill>
+                    <a:blip r:embed="rId16"/>
+                    <a:stretch>
+                      <a:fillRect/>
+                    </a:stretch>
+                  </pic:blipFill>
+                  <pic:spPr>
+                    <a:xfrm>
+                      <a:off x="0" y="0"/>
+                      <a:ext cx="3780000" cy="3198462"/>
+                    </a:xfrm>
+                    <a:prstGeom prst="rect"/>
+                  </pic:spPr>
+                </pic:pic>
+              </a:graphicData>
+            </a:graphic>
+          </wp:inline>
+        </w:drawing>
+      </w:r>
+    </w:p>
+    <w:p>
+      <w:r>
+        <w:t>由两个等边三角形的60°角，EP∥BQ，因此EP∥FQ。</w:t>
+        <w:br/>
+        <w:t>EP=AP，BF=BP，BQ=AB。</w:t>
+        <w:br/>
+        <w:t>FQ=BQ-BF=AB-BP=AP。</w:t>
+      </w:r>
+    </w:p>
+    <w:p>
+      <w:r>
+        <w:t>本步结论：EP=FQ，EP∥FQ。</w:t>
+      </w:r>
+    </w:p>
+    <w:p>
+      <w:r>
+        <w:br w:type="page"/>
+      </w:r>
+    </w:p>
+    <w:p>
+      <w:pPr>
+        <w:pStyle w:val="Title"/>
+      </w:pPr>
+      <w:r>
+        <w:t>第2题：等边动点与中点轨迹</w:t>
+      </w:r>
+    </w:p>
+    <w:p>
+      <w:pPr>
+        <w:pStyle w:val="Heading1"/>
+      </w:pPr>
+      <w:r>
+        <w:t>第3步：证明M也恰好是QP中点</w:t>
+      </w:r>
+    </w:p>
+    <w:p>
+      <w:r>
+        <w:t>作图：连PM、QM，突出△PEM和△QFM。</w:t>
+      </w:r>
+    </w:p>
+    <w:p>
+      <w:r>
+        <w:drawing>
+          <wp:inline xmlns:a="http://schemas.openxmlformats.org/drawingml/2006/main" xmlns:pic="http://schemas.openxmlformats.org/drawingml/2006/picture">
+            <wp:extent cx="3780000" cy="3198462"/>
+            <wp:docPr id="8" name="Picture 8"/>
+            <wp:cNvGraphicFramePr>
+              <a:graphicFrameLocks noChangeAspect="1"/>
+            </wp:cNvGraphicFramePr>
+            <a:graphic>
+              <a:graphicData uri="http://schemas.openxmlformats.org/drawingml/2006/picture">
+                <pic:pic>
+                  <pic:nvPicPr>
+                    <pic:cNvPr id="0" name="q2sas.png"/>
+                    <pic:cNvPicPr/>
+                  </pic:nvPicPr>
+                  <pic:blipFill>
+                    <a:blip r:embed="rId17"/>
+                    <a:stretch>
+                      <a:fillRect/>
+                    </a:stretch>
+                  </pic:blipFill>
+                  <pic:spPr>
+                    <a:xfrm>
+                      <a:off x="0" y="0"/>
+                      <a:ext cx="3780000" cy="3198462"/>
+                    </a:xfrm>
+                    <a:prstGeom prst="rect"/>
+                  </pic:spPr>
+                </pic:pic>
+              </a:graphicData>
+            </a:graphic>
+          </wp:inline>
+        </w:drawing>
+      </w:r>
+    </w:p>
+    <w:p>
+      <w:r>
+        <w:t>①EM=FM（M为EF中点）。</w:t>
+        <w:br/>
+        <w:t>②EP=FQ（第2步）。</w:t>
+        <w:br/>
+        <w:t>③∠PEM=∠QFM（平行线）。</w:t>
+        <w:br/>
+        <w:t>所以△PEM≌△QFM（SAS），PM=QM。P、Q在EF两侧，且∠EMP=∠FMQ、EM与FM反向共线，故MP、MQ也反向共线。</w:t>
+      </w:r>
+    </w:p>
+    <w:p>
+      <w:r>
+        <w:t>本步结论：Q、M、P共线且QM=MP，M是QP中点。</w:t>
+      </w:r>
+    </w:p>
+    <w:p>
+      <w:r>
+        <w:br w:type="page"/>
+      </w:r>
+    </w:p>
+    <w:p>
+      <w:pPr>
+        <w:pStyle w:val="Title"/>
+      </w:pPr>
+      <w:r>
+        <w:t>第2题：等边动点与中点轨迹</w:t>
+      </w:r>
+    </w:p>
+    <w:p>
+      <w:pPr>
+        <w:pStyle w:val="Heading1"/>
+      </w:pPr>
+      <w:r>
+        <w:t>第4步：证明M走的是固定直线</w:t>
+      </w:r>
+    </w:p>
+    <w:p>
+      <w:r>
+        <w:t>作图：取QA中点H，连HM；单独看△QAP。</w:t>
+      </w:r>
+    </w:p>
+    <w:p>
+      <w:r>
+        <w:drawing>
+          <wp:inline xmlns:a="http://schemas.openxmlformats.org/drawingml/2006/main" xmlns:pic="http://schemas.openxmlformats.org/drawingml/2006/picture">
+            <wp:extent cx="3780000" cy="3198462"/>
+            <wp:docPr id="9" name="Picture 9"/>
+            <wp:cNvGraphicFramePr>
+              <a:graphicFrameLocks noChangeAspect="1"/>
+            </wp:cNvGraphicFramePr>
+            <a:graphic>
+              <a:graphicData uri="http://schemas.openxmlformats.org/drawingml/2006/picture">
+                <pic:pic>
+                  <pic:nvPicPr>
+                    <pic:cNvPr id="0" name="q2line.png"/>
+                    <pic:cNvPicPr/>
+                  </pic:nvPicPr>
+                  <pic:blipFill>
+                    <a:blip r:embed="rId18"/>
+                    <a:stretch>
+                      <a:fillRect/>
+                    </a:stretch>
+                  </pic:blipFill>
+                  <pic:spPr>
+                    <a:xfrm>
+                      <a:off x="0" y="0"/>
+                      <a:ext cx="3780000" cy="3198462"/>
+                    </a:xfrm>
+                    <a:prstGeom prst="rect"/>
+                  </pic:spPr>
+                </pic:pic>
+              </a:graphicData>
+            </a:graphic>
+          </wp:inline>
+        </w:drawing>
+      </w:r>
+    </w:p>
+    <w:p>
+      <w:r>
+        <w:t>H为QA中点，M为QP中点。</w:t>
+        <w:br/>
+        <w:t>由中点连线性质，HM∥AP。</w:t>
+        <w:br/>
+        <w:t>A、P都在固定直线AB上，所以HM始终平行AB。H也固定，因此M始终在过H且平行AB的同一条直线上。</w:t>
+      </w:r>
+    </w:p>
+    <w:p>
+      <w:r>
+        <w:t>本步结论：M沿固定直线运动，不是曲线；未学中点性质先看附录。</w:t>
+      </w:r>
+    </w:p>
+    <w:p>
+      <w:r>
+        <w:br w:type="page"/>
+      </w:r>
+    </w:p>
+    <w:p>
+      <w:pPr>
+        <w:pStyle w:val="Title"/>
+      </w:pPr>
+      <w:r>
+        <w:t>第2题：等边动点与中点轨迹</w:t>
+      </w:r>
+    </w:p>
+    <w:p>
+      <w:pPr>
+        <w:pStyle w:val="Heading1"/>
+      </w:pPr>
+      <w:r>
+        <w:t>第5步：定位起点终点，再算路径长</w:t>
+      </w:r>
+    </w:p>
+    <w:p>
+      <w:r>
+        <w:t>作图：取QC、QD的中点K、L，连KL。</w:t>
+      </w:r>
+    </w:p>
+    <w:p>
+      <w:r>
+        <w:drawing>
+          <wp:inline xmlns:a="http://schemas.openxmlformats.org/drawingml/2006/main" xmlns:pic="http://schemas.openxmlformats.org/drawingml/2006/picture">
+            <wp:extent cx="3780000" cy="3198462"/>
+            <wp:docPr id="10" name="Picture 10"/>
+            <wp:cNvGraphicFramePr>
+              <a:graphicFrameLocks noChangeAspect="1"/>
+            </wp:cNvGraphicFramePr>
+            <a:graphic>
+              <a:graphicData uri="http://schemas.openxmlformats.org/drawingml/2006/picture">
+                <pic:pic>
+                  <pic:nvPicPr>
+                    <pic:cNvPr id="0" name="q2length.png"/>
+                    <pic:cNvPicPr/>
+                  </pic:nvPicPr>
+                  <pic:blipFill>
+                    <a:blip r:embed="rId19"/>
+                    <a:stretch>
+                      <a:fillRect/>
+                    </a:stretch>
+                  </pic:blipFill>
+                  <pic:spPr>
+                    <a:xfrm>
+                      <a:off x="0" y="0"/>
+                      <a:ext cx="3780000" cy="3198462"/>
+                    </a:xfrm>
+                    <a:prstGeom prst="rect"/>
+                  </pic:spPr>
+                </pic:pic>
+              </a:graphicData>
+            </a:graphic>
+          </wp:inline>
+        </w:drawing>
+      </w:r>
+    </w:p>
+    <w:p>
+      <w:r>
+        <w:t>P=C时，M=K；P=D时，M=L。</w:t>
+        <w:br/>
+        <w:t>在△QCD中，KL是中点连线。</w:t>
+        <w:br/>
+        <w:t>CD=AB-AC-BD=20-2-2=16。</w:t>
+        <w:br/>
+        <w:t>KL=CD/2=8。P单向从C到D，M也单向从K到L。</w:t>
+      </w:r>
+    </w:p>
+    <w:p>
+      <w:r>
+        <w:t>本步结论：M的运动路径是线段KL，路径长8。</w:t>
+      </w:r>
+    </w:p>
+    <w:p>
+      <w:r>
+        <w:br w:type="page"/>
+      </w:r>
+    </w:p>
+    <w:p>
+      <w:pPr>
+        <w:pStyle w:val="Title"/>
+      </w:pPr>
+      <w:r>
+        <w:t>第3题：基本图、一般图和延长线变式</w:t>
+      </w:r>
+    </w:p>
+    <w:p>
+      <w:pPr>
+        <w:pStyle w:val="Heading1"/>
+      </w:pPr>
+      <w:r>
+        <w:t>（1）第1步：在B外侧复制DF</w:t>
+      </w:r>
+    </w:p>
+    <w:p>
+      <w:r>
+        <w:t>作图：延长CB到G，使BG=DF，连AG。</w:t>
+      </w:r>
+    </w:p>
+    <w:p>
+      <w:r>
+        <w:drawing>
+          <wp:inline xmlns:a="http://schemas.openxmlformats.org/drawingml/2006/main" xmlns:pic="http://schemas.openxmlformats.org/drawingml/2006/picture">
+            <wp:extent cx="3780000" cy="3198462"/>
+            <wp:docPr id="11" name="Picture 11"/>
+            <wp:cNvGraphicFramePr>
+              <a:graphicFrameLocks noChangeAspect="1"/>
+            </wp:cNvGraphicFramePr>
+            <a:graphic>
+              <a:graphicData uri="http://schemas.openxmlformats.org/drawingml/2006/picture">
+                <pic:pic>
+                  <pic:nvPicPr>
+                    <pic:cNvPr id="0" name="q3s1.png"/>
+                    <pic:cNvPicPr/>
+                  </pic:nvPicPr>
+                  <pic:blipFill>
+                    <a:blip r:embed="rId20"/>
+                    <a:stretch>
+                      <a:fillRect/>
+                    </a:stretch>
+                  </pic:blipFill>
+                  <pic:spPr>
+                    <a:xfrm>
+                      <a:off x="0" y="0"/>
+                      <a:ext cx="3780000" cy="3198462"/>
+                    </a:xfrm>
+                    <a:prstGeom prst="rect"/>
+                  </pic:spPr>
+                </pic:pic>
+              </a:graphicData>
+            </a:graphic>
+          </wp:inline>
+        </w:drawing>
+      </w:r>
+    </w:p>
+    <w:p>
+      <w:r>
+        <w:t>正方形给AB=AD，∠ABG=∠ADF=90°。</w:t>
+        <w:br/>
+        <w:t>再加BG=DF，得到</w:t>
+        <w:br/>
+        <w:t>△ABG≌△ADF（SAS）。</w:t>
+        <w:br/>
+        <w:t>所以AG=AF，∠BAG=∠DAF。</w:t>
+      </w:r>
+    </w:p>
+    <w:p>
+      <w:r>
+        <w:t>本步结论：第一次全等得到：AG=AF，以及一组对应角相等。</w:t>
+      </w:r>
+    </w:p>
+    <w:p>
+      <w:r>
+        <w:br w:type="page"/>
+      </w:r>
+    </w:p>
+    <w:p>
+      <w:pPr>
+        <w:pStyle w:val="Title"/>
+      </w:pPr>
+      <w:r>
+        <w:t>第3题：基本图、一般图和延长线变式</w:t>
+      </w:r>
+    </w:p>
+    <w:p>
+      <w:pPr>
+        <w:pStyle w:val="Heading1"/>
+      </w:pPr>
+      <w:r>
+        <w:t>（1）第2步：第二次全等，得到加法关系</w:t>
+      </w:r>
+    </w:p>
+    <w:p>
+      <w:r>
+        <w:t>作图：突出△GAE和△FAE；红绿线段GE由GB与BE组成。</w:t>
+      </w:r>
+    </w:p>
+    <w:p>
+      <w:r>
+        <w:drawing>
+          <wp:inline xmlns:a="http://schemas.openxmlformats.org/drawingml/2006/main" xmlns:pic="http://schemas.openxmlformats.org/drawingml/2006/picture">
+            <wp:extent cx="3780000" cy="3198462"/>
+            <wp:docPr id="12" name="Picture 12"/>
+            <wp:cNvGraphicFramePr>
+              <a:graphicFrameLocks noChangeAspect="1"/>
+            </wp:cNvGraphicFramePr>
+            <a:graphic>
+              <a:graphicData uri="http://schemas.openxmlformats.org/drawingml/2006/picture">
+                <pic:pic>
+                  <pic:nvPicPr>
+                    <pic:cNvPr id="0" name="q3s2.png"/>
+                    <pic:cNvPicPr/>
+                  </pic:nvPicPr>
+                  <pic:blipFill>
+                    <a:blip r:embed="rId21"/>
+                    <a:stretch>
+                      <a:fillRect/>
+                    </a:stretch>
+                  </pic:blipFill>
+                  <pic:spPr>
+                    <a:xfrm>
+                      <a:off x="0" y="0"/>
+                      <a:ext cx="3780000" cy="3198462"/>
+                    </a:xfrm>
+                    <a:prstGeom prst="rect"/>
+                  </pic:spPr>
+                </pic:pic>
+              </a:graphicData>
+            </a:graphic>
+          </wp:inline>
+        </w:drawing>
+      </w:r>
+    </w:p>
+    <w:p>
+      <w:r>
+        <w:t>∠GAE=∠BAG+∠BAE</w:t>
+        <w:br/>
+        <w:t>=∠DAF+∠BAE</w:t>
+        <w:br/>
+        <w:t>=90°-45°=45°=∠EAF。</w:t>
+        <w:br/>
+        <w:t>AG=AF，AE公共，所以△GAE≌△FAE（SAS），GE=FE。</w:t>
+        <w:br/>
+        <w:t>G、B、E依次共线，GE=GB+BE。</w:t>
+      </w:r>
+    </w:p>
+    <w:p>
+      <w:r>
+        <w:t>本步结论：EF=GE=GB+BE=DF+BE。</w:t>
+      </w:r>
+    </w:p>
+    <w:p>
+      <w:r>
+        <w:br w:type="page"/>
+      </w:r>
+    </w:p>
+    <w:p>
+      <w:pPr>
+        <w:pStyle w:val="Title"/>
+      </w:pPr>
+      <w:r>
+        <w:t>第3题：基本图、一般图和延长线变式</w:t>
+      </w:r>
+    </w:p>
+    <w:p>
+      <w:pPr>
+        <w:pStyle w:val="Heading1"/>
+      </w:pPr>
+      <w:r>
+        <w:t>（2）第1步：一般四边形中仍复制DF</w:t>
+      </w:r>
+    </w:p>
+    <w:p>
+      <w:r>
+        <w:t>作图：仍延长CB到G，使BG=DF，连AG。</w:t>
+      </w:r>
+    </w:p>
+    <w:p>
+      <w:r>
+        <w:drawing>
+          <wp:inline xmlns:a="http://schemas.openxmlformats.org/drawingml/2006/main" xmlns:pic="http://schemas.openxmlformats.org/drawingml/2006/picture">
+            <wp:extent cx="3780000" cy="3198462"/>
+            <wp:docPr id="13" name="Picture 13"/>
+            <wp:cNvGraphicFramePr>
+              <a:graphicFrameLocks noChangeAspect="1"/>
+            </wp:cNvGraphicFramePr>
+            <a:graphic>
+              <a:graphicData uri="http://schemas.openxmlformats.org/drawingml/2006/picture">
+                <pic:pic>
+                  <pic:nvPicPr>
+                    <pic:cNvPr id="0" name="q3g1.png"/>
+                    <pic:cNvPicPr/>
+                  </pic:nvPicPr>
+                  <pic:blipFill>
+                    <a:blip r:embed="rId22"/>
+                    <a:stretch>
+                      <a:fillRect/>
+                    </a:stretch>
+                  </pic:blipFill>
+                  <pic:spPr>
+                    <a:xfrm>
+                      <a:off x="0" y="0"/>
+                      <a:ext cx="3780000" cy="3198462"/>
+                    </a:xfrm>
+                    <a:prstGeom prst="rect"/>
+                  </pic:spPr>
+                </pic:pic>
+              </a:graphicData>
+            </a:graphic>
+          </wp:inline>
+        </w:drawing>
+      </w:r>
+    </w:p>
+    <w:p>
+      <w:r>
+        <w:t>AB=AD。</w:t>
+        <w:br/>
+        <w:t>∠ABG=180°-∠ABC。</w:t>
+        <w:br/>
+        <w:t>已知∠ABC+∠ADC=180°，所以∠ABG=∠ADC=∠ADF。</w:t>
+        <w:br/>
+        <w:t>结合BG=DF，得到△ABG≌△ADF（SAS）。</w:t>
+      </w:r>
+    </w:p>
+    <w:p>
+      <w:r>
+        <w:t>本步结论：仍有AG=AF，∠BAG=∠DAF；不需要四个角都为90°。</w:t>
+      </w:r>
+    </w:p>
+    <w:p>
+      <w:r>
+        <w:br w:type="page"/>
+      </w:r>
+    </w:p>
+    <w:p>
+      <w:pPr>
+        <w:pStyle w:val="Title"/>
+      </w:pPr>
+      <w:r>
+        <w:t>第3题：基本图、一般图和延长线变式</w:t>
+      </w:r>
+    </w:p>
+    <w:p>
+      <w:pPr>
+        <w:pStyle w:val="Heading1"/>
+      </w:pPr>
+      <w:r>
+        <w:t>（2）第2步：用“半角”替代45°</w:t>
+      </w:r>
+    </w:p>
+    <w:p>
+      <w:r>
+        <w:t>作图：突出第二组全等三角形；半角条件用在A处。</w:t>
+      </w:r>
+    </w:p>
+    <w:p>
+      <w:r>
+        <w:drawing>
+          <wp:inline xmlns:a="http://schemas.openxmlformats.org/drawingml/2006/main" xmlns:pic="http://schemas.openxmlformats.org/drawingml/2006/picture">
+            <wp:extent cx="3780000" cy="3198462"/>
+            <wp:docPr id="14" name="Picture 14"/>
+            <wp:cNvGraphicFramePr>
+              <a:graphicFrameLocks noChangeAspect="1"/>
+            </wp:cNvGraphicFramePr>
+            <a:graphic>
+              <a:graphicData uri="http://schemas.openxmlformats.org/drawingml/2006/picture">
+                <pic:pic>
+                  <pic:nvPicPr>
+                    <pic:cNvPr id="0" name="q3g2.png"/>
+                    <pic:cNvPicPr/>
+                  </pic:nvPicPr>
+                  <pic:blipFill>
+                    <a:blip r:embed="rId23"/>
+                    <a:stretch>
+                      <a:fillRect/>
+                    </a:stretch>
+                  </pic:blipFill>
+                  <pic:spPr>
+                    <a:xfrm>
+                      <a:off x="0" y="0"/>
+                      <a:ext cx="3780000" cy="3198462"/>
+                    </a:xfrm>
+                    <a:prstGeom prst="rect"/>
+                  </pic:spPr>
+                </pic:pic>
+              </a:graphicData>
+            </a:graphic>
+          </wp:inline>
+        </w:drawing>
+      </w:r>
+    </w:p>
+    <w:p>
+      <w:r>
+        <w:t>∠GAE=∠BAG+∠BAE</w:t>
+        <w:br/>
+        <w:t>=∠DAF+∠BAE</w:t>
+        <w:br/>
+        <w:t>=∠BAD-∠EAF</w:t>
+        <w:br/>
+        <w:t>=∠EAF（半角条件）。</w:t>
+        <w:br/>
+        <w:t>由AG=AF、AE公共，△GAE≌△FAE（SAS），GE=EF。</w:t>
+        <w:br/>
+        <w:t>依然G、B、E依次共线。</w:t>
+      </w:r>
+    </w:p>
+    <w:p>
+      <w:r>
+        <w:t>本步结论：结论仍成立：EF=BE+DF。</w:t>
+      </w:r>
+    </w:p>
+    <w:p>
+      <w:r>
+        <w:br w:type="page"/>
+      </w:r>
+    </w:p>
+    <w:p>
+      <w:pPr>
+        <w:pStyle w:val="Title"/>
+      </w:pPr>
+      <w:r>
+        <w:t>第3题：基本图、一般图和延长线变式</w:t>
+      </w:r>
+    </w:p>
+    <w:p>
+      <w:pPr>
+        <w:pStyle w:val="Heading1"/>
+      </w:pPr>
+      <w:r>
+        <w:t>（3）第1步：G这次放在B、E之间</w:t>
+      </w:r>
+    </w:p>
+    <w:p>
+      <w:r>
+        <w:t>作图：在射线BC上取G，使BG=DF；连AG。不是延长CB。</w:t>
+      </w:r>
+    </w:p>
+    <w:p>
+      <w:r>
+        <w:drawing>
+          <wp:inline xmlns:a="http://schemas.openxmlformats.org/drawingml/2006/main" xmlns:pic="http://schemas.openxmlformats.org/drawingml/2006/picture">
+            <wp:extent cx="3780000" cy="3198462"/>
+            <wp:docPr id="15" name="Picture 15"/>
+            <wp:cNvGraphicFramePr>
+              <a:graphicFrameLocks noChangeAspect="1"/>
+            </wp:cNvGraphicFramePr>
+            <a:graphic>
+              <a:graphicData uri="http://schemas.openxmlformats.org/drawingml/2006/picture">
+                <pic:pic>
+                  <pic:nvPicPr>
+                    <pic:cNvPr id="0" name="q3o1.png"/>
+                    <pic:cNvPicPr/>
+                  </pic:nvPicPr>
+                  <pic:blipFill>
+                    <a:blip r:embed="rId24"/>
+                    <a:stretch>
+                      <a:fillRect/>
+                    </a:stretch>
+                  </pic:blipFill>
+                  <pic:spPr>
+                    <a:xfrm>
+                      <a:off x="0" y="0"/>
+                      <a:ext cx="3780000" cy="3198462"/>
+                    </a:xfrm>
+                    <a:prstGeom prst="rect"/>
+                  </pic:spPr>
+                </pic:pic>
+              </a:graphicData>
+            </a:graphic>
+          </wp:inline>
+        </w:drawing>
+      </w:r>
+    </w:p>
+    <w:p>
+      <w:r>
+        <w:t>F在CD越过D的延长线上。</w:t>
+        <w:br/>
+        <w:t>∠ADF=180°-∠ADC=∠ABC=∠ABG。</w:t>
+        <w:br/>
+        <w:t>AB=AD，BG=DF，所以△ABG≌△ADF（SAS）。</w:t>
+        <w:br/>
+        <w:t>得到AG=AF，∠BAG=∠DAF。</w:t>
+      </w:r>
+    </w:p>
+    <w:p>
+      <w:r>
+        <w:t>本步结论：G改放在B朝C的方向；第一组全等仍成立。</w:t>
+      </w:r>
+    </w:p>
+    <w:p>
+      <w:r>
+        <w:br w:type="page"/>
+      </w:r>
+    </w:p>
+    <w:p>
+      <w:pPr>
+        <w:pStyle w:val="Title"/>
+      </w:pPr>
+      <w:r>
+        <w:t>第3题：基本图、一般图和延长线变式</w:t>
+      </w:r>
+    </w:p>
+    <w:p>
+      <w:pPr>
+        <w:pStyle w:val="Heading1"/>
+      </w:pPr>
+      <w:r>
+        <w:t>（3）第2步：相等的是GE，最终要做减法</w:t>
+      </w:r>
+    </w:p>
+    <w:p>
+      <w:r>
+        <w:t>作图：突出△GAE和△FAE，核对B、G、E的顺序。</w:t>
+      </w:r>
+    </w:p>
+    <w:p>
+      <w:r>
+        <w:drawing>
+          <wp:inline xmlns:a="http://schemas.openxmlformats.org/drawingml/2006/main" xmlns:pic="http://schemas.openxmlformats.org/drawingml/2006/picture">
+            <wp:extent cx="3780000" cy="3198462"/>
+            <wp:docPr id="16" name="Picture 16"/>
+            <wp:cNvGraphicFramePr>
+              <a:graphicFrameLocks noChangeAspect="1"/>
+            </wp:cNvGraphicFramePr>
+            <a:graphic>
+              <a:graphicData uri="http://schemas.openxmlformats.org/drawingml/2006/picture">
+                <pic:pic>
+                  <pic:nvPicPr>
+                    <pic:cNvPr id="0" name="q3o2.png"/>
+                    <pic:cNvPicPr/>
+                  </pic:nvPicPr>
+                  <pic:blipFill>
+                    <a:blip r:embed="rId25"/>
+                    <a:stretch>
+                      <a:fillRect/>
+                    </a:stretch>
+                  </pic:blipFill>
+                  <pic:spPr>
+                    <a:xfrm>
+                      <a:off x="0" y="0"/>
+                      <a:ext cx="3780000" cy="3198462"/>
+                    </a:xfrm>
+                    <a:prstGeom prst="rect"/>
+                  </pic:spPr>
+                </pic:pic>
+              </a:graphicData>
+            </a:graphic>
+          </wp:inline>
+        </w:drawing>
+      </w:r>
+    </w:p>
+    <w:p>
+      <w:r>
+        <w:t>∠BAE=∠EAF+∠DAF，所以∠GAE=∠BAE-∠BAG=∠EAF。</w:t>
+        <w:br/>
+        <w:t>AG=AF、AE公共，得到△GAE≌△FAE（SAS），GE=EF。</w:t>
+        <w:br/>
+        <w:t>0&lt;∠BAG&lt;∠BAE，所以AG在∠BAE内部，G在BE内部。</w:t>
+        <w:br/>
+        <w:t>GE=BE-BG=BE-DF。</w:t>
+      </w:r>
+    </w:p>
+    <w:p>
+      <w:r>
+        <w:t>本步结论：BE=DF+EF（与前两问的加法关系不同）。</w:t>
+      </w:r>
+    </w:p>
+    <w:p>
+      <w:r>
+        <w:br w:type="page"/>
+      </w:r>
+    </w:p>
+    <w:p>
+      <w:pPr>
+        <w:pStyle w:val="Title"/>
+      </w:pPr>
+      <w:r>
+        <w:t>第4题：逐步图解</w:t>
+      </w:r>
+    </w:p>
+    <w:p>
+      <w:pPr>
+        <w:pStyle w:val="Heading1"/>
+      </w:pPr>
+      <w:r>
+        <w:t>（1）第1步：PM是哪一个三角形的中点连线？</w:t>
+      </w:r>
+    </w:p>
+    <w:p>
+      <w:r>
+        <w:t>作图：先只突出△DCE，PM用红色画出。</w:t>
+      </w:r>
+    </w:p>
+    <w:p>
+      <w:r>
+        <w:drawing>
+          <wp:inline xmlns:a="http://schemas.openxmlformats.org/drawingml/2006/main" xmlns:pic="http://schemas.openxmlformats.org/drawingml/2006/picture">
+            <wp:extent cx="3780000" cy="3198462"/>
+            <wp:docPr id="17" name="Picture 17"/>
+            <wp:cNvGraphicFramePr>
+              <a:graphicFrameLocks noChangeAspect="1"/>
+            </wp:cNvGraphicFramePr>
+            <a:graphic>
+              <a:graphicData uri="http://schemas.openxmlformats.org/drawingml/2006/picture">
+                <pic:pic>
+                  <pic:nvPicPr>
+                    <pic:cNvPr id="0" name="q4a1.png"/>
+                    <pic:cNvPicPr/>
+                  </pic:nvPicPr>
+                  <pic:blipFill>
+                    <a:blip r:embed="rId26"/>
+                    <a:stretch>
+                      <a:fillRect/>
+                    </a:stretch>
+                  </pic:blipFill>
+                  <pic:spPr>
+                    <a:xfrm>
+                      <a:off x="0" y="0"/>
+                      <a:ext cx="3780000" cy="3198462"/>
+                    </a:xfrm>
+                    <a:prstGeom prst="rect"/>
+                  </pic:spPr>
+                </pic:pic>
+              </a:graphicData>
+            </a:graphic>
+          </wp:inline>
+        </w:drawing>
+      </w:r>
+    </w:p>
+    <w:p>
+      <w:r>
+        <w:t>题目说P是DC中点，M是DE中点。</w:t>
+        <w:br/>
+        <w:t>所以DP=PC，DM=ME。</w:t>
+        <w:br/>
+        <w:t>PM连接△DCE的两边中点。</w:t>
+        <w:br/>
+        <w:t>由中点连线性质：</w:t>
+        <w:br/>
+        <w:t>PM∥CE，PM=CE/2。</w:t>
+        <w:br/>
+        <w:t>若学生未学此性质，先讲附录配图证明。</w:t>
+      </w:r>
+    </w:p>
+    <w:p>
+      <w:r>
+        <w:t>本步结论：第一条关系：PM∥CE，PM=CE/2。</w:t>
+      </w:r>
+    </w:p>
+    <w:p>
+      <w:r>
+        <w:br w:type="page"/>
+      </w:r>
+    </w:p>
+    <w:p>
+      <w:pPr>
+        <w:pStyle w:val="Title"/>
+      </w:pPr>
+      <w:r>
+        <w:t>第4题：逐步图解</w:t>
+      </w:r>
+    </w:p>
+    <w:p>
+      <w:pPr>
+        <w:pStyle w:val="Heading1"/>
+      </w:pPr>
+      <w:r>
+        <w:t>（1）第2步：PN属于另一个三角形</w:t>
+      </w:r>
+    </w:p>
+    <w:p>
+      <w:r>
+        <w:t>作图：现在改为突出△DCB，PN用红色画出。</w:t>
+      </w:r>
+    </w:p>
+    <w:p>
+      <w:r>
+        <w:drawing>
+          <wp:inline xmlns:a="http://schemas.openxmlformats.org/drawingml/2006/main" xmlns:pic="http://schemas.openxmlformats.org/drawingml/2006/picture">
+            <wp:extent cx="3780000" cy="3198462"/>
+            <wp:docPr id="18" name="Picture 18"/>
+            <wp:cNvGraphicFramePr>
+              <a:graphicFrameLocks noChangeAspect="1"/>
+            </wp:cNvGraphicFramePr>
+            <a:graphic>
+              <a:graphicData uri="http://schemas.openxmlformats.org/drawingml/2006/picture">
+                <pic:pic>
+                  <pic:nvPicPr>
+                    <pic:cNvPr id="0" name="q4a2.png"/>
+                    <pic:cNvPicPr/>
+                  </pic:nvPicPr>
+                  <pic:blipFill>
+                    <a:blip r:embed="rId27"/>
+                    <a:stretch>
+                      <a:fillRect/>
+                    </a:stretch>
+                  </pic:blipFill>
+                  <pic:spPr>
+                    <a:xfrm>
+                      <a:off x="0" y="0"/>
+                      <a:ext cx="3780000" cy="3198462"/>
+                    </a:xfrm>
+                    <a:prstGeom prst="rect"/>
+                  </pic:spPr>
+                </pic:pic>
+              </a:graphicData>
+            </a:graphic>
+          </wp:inline>
+        </w:drawing>
+      </w:r>
+    </w:p>
+    <w:p>
+      <w:r>
+        <w:t>P仍是DC中点，但N是BC中点。</w:t>
+        <w:br/>
+        <w:t>所以DP=PC，BN=NC。</w:t>
+        <w:br/>
+        <w:t>PN连接△DCB的两边中点。</w:t>
+        <w:br/>
+        <w:t>因此PN∥DB，PN=DB/2。</w:t>
+        <w:br/>
+        <w:t>注意：PM与PN分别属于两个不同的大三角形。</w:t>
+      </w:r>
+    </w:p>
+    <w:p>
+      <w:r>
+        <w:t>本步结论：第二条关系：PN∥DB，PN=DB/2。</w:t>
+      </w:r>
+    </w:p>
+    <w:p>
+      <w:r>
+        <w:br w:type="page"/>
+      </w:r>
+    </w:p>
+    <w:p>
+      <w:pPr>
+        <w:pStyle w:val="Title"/>
+      </w:pPr>
+      <w:r>
+        <w:t>第4题：逐步图解</w:t>
+      </w:r>
+    </w:p>
+    <w:p>
+      <w:pPr>
+        <w:pStyle w:val="Heading1"/>
+      </w:pPr>
+      <w:r>
+        <w:t>（1）第3步：先用初始位置得出答案</w:t>
+      </w:r>
+    </w:p>
+    <w:p>
+      <w:r>
+        <w:t>作图：观察未旋转的图：D在AB上，E在AC上。</w:t>
+      </w:r>
+    </w:p>
+    <w:p>
+      <w:r>
+        <w:drawing>
+          <wp:inline xmlns:a="http://schemas.openxmlformats.org/drawingml/2006/main" xmlns:pic="http://schemas.openxmlformats.org/drawingml/2006/picture">
+            <wp:extent cx="3780000" cy="3198462"/>
+            <wp:docPr id="19" name="Picture 19"/>
+            <wp:cNvGraphicFramePr>
+              <a:graphicFrameLocks noChangeAspect="1"/>
+            </wp:cNvGraphicFramePr>
+            <a:graphic>
+              <a:graphicData uri="http://schemas.openxmlformats.org/drawingml/2006/picture">
+                <pic:pic>
+                  <pic:nvPicPr>
+                    <pic:cNvPr id="0" name="q4a3.png"/>
+                    <pic:cNvPicPr/>
+                  </pic:nvPicPr>
+                  <pic:blipFill>
+                    <a:blip r:embed="rId28"/>
+                    <a:stretch>
+                      <a:fillRect/>
+                    </a:stretch>
+                  </pic:blipFill>
+                  <pic:spPr>
+                    <a:xfrm>
+                      <a:off x="0" y="0"/>
+                      <a:ext cx="3780000" cy="3198462"/>
+                    </a:xfrm>
+                    <a:prstGeom prst="rect"/>
+                  </pic:spPr>
+                </pic:pic>
+              </a:graphicData>
+            </a:graphic>
+          </wp:inline>
+        </w:drawing>
+      </w:r>
+    </w:p>
+    <w:p>
+      <w:r>
+        <w:t>BD=AB-AD，CE=AC-AE。</w:t>
+        <w:br/>
+        <w:t>AB=AC，AD=AE，所以BD=CE。</w:t>
+        <w:br/>
+        <w:t>AB⊥AC，因此BD⊥CE。</w:t>
+        <w:br/>
+        <w:t>结合前两步，PM=CE/2=BD/2=PN；PM∥CE、PN∥BD，所以PM⊥PN。</w:t>
+      </w:r>
+    </w:p>
+    <w:p>
+      <w:r>
+        <w:t>本步结论：第（1）问：PM=PN，PM⊥PN。</w:t>
+      </w:r>
+    </w:p>
+    <w:p>
+      <w:r>
+        <w:br w:type="page"/>
+      </w:r>
+    </w:p>
+    <w:p>
+      <w:pPr>
+        <w:pStyle w:val="Title"/>
+      </w:pPr>
+      <w:r>
+        <w:t>第4题：逐步图解</w:t>
+      </w:r>
+    </w:p>
+    <w:p>
+      <w:pPr>
+        <w:pStyle w:val="Heading1"/>
+      </w:pPr>
+      <w:r>
+        <w:t>（2）第1步：连接BD、CE，证明等长</w:t>
+      </w:r>
+    </w:p>
+    <w:p>
+      <w:r>
+        <w:t>作图：连BD、CE；红色△BAD与蓝色△CAE作对照。</w:t>
+      </w:r>
+    </w:p>
+    <w:p>
+      <w:r>
+        <w:drawing>
+          <wp:inline xmlns:a="http://schemas.openxmlformats.org/drawingml/2006/main" xmlns:pic="http://schemas.openxmlformats.org/drawingml/2006/picture">
+            <wp:extent cx="3780000" cy="3198462"/>
+            <wp:docPr id="20" name="Picture 20"/>
+            <wp:cNvGraphicFramePr>
+              <a:graphicFrameLocks noChangeAspect="1"/>
+            </wp:cNvGraphicFramePr>
+            <a:graphic>
+              <a:graphicData uri="http://schemas.openxmlformats.org/drawingml/2006/picture">
+                <pic:pic>
+                  <pic:nvPicPr>
+                    <pic:cNvPr id="0" name="q4sas.png"/>
+                    <pic:cNvPicPr/>
+                  </pic:nvPicPr>
+                  <pic:blipFill>
+                    <a:blip r:embed="rId29"/>
+                    <a:stretch>
+                      <a:fillRect/>
+                    </a:stretch>
+                  </pic:blipFill>
+                  <pic:spPr>
+                    <a:xfrm>
+                      <a:off x="0" y="0"/>
+                      <a:ext cx="3780000" cy="3198462"/>
+                    </a:xfrm>
+                    <a:prstGeom prst="rect"/>
+                  </pic:spPr>
+                </pic:pic>
+              </a:graphicData>
+            </a:graphic>
+          </wp:inline>
+        </w:drawing>
+      </w:r>
+    </w:p>
+    <w:p>
+      <w:r>
+        <w:t>图2中∠BAC=∠DAE=90°，且D在∠BAC内部。</w:t>
+        <w:br/>
+        <w:t>∠BAD=90°-∠DAC。</w:t>
+        <w:br/>
+        <w:t>∠CAE=90°-∠DAC。</w:t>
+        <w:br/>
+        <w:t>所以∠BAD=∠CAE。</w:t>
+        <w:br/>
+        <w:t>AB=AC，AD=AE，故△BAD≌△CAE（SAS）。</w:t>
+      </w:r>
+    </w:p>
+    <w:p>
+      <w:r>
+        <w:t>本步结论：BD=CE；对应顶点是B与C、A与A、D与E。</w:t>
+      </w:r>
+    </w:p>
+    <w:p>
+      <w:r>
+        <w:br w:type="page"/>
+      </w:r>
+    </w:p>
+    <w:p>
+      <w:pPr>
+        <w:pStyle w:val="Title"/>
+      </w:pPr>
+      <w:r>
+        <w:t>第4题：逐步图解</w:t>
+      </w:r>
+    </w:p>
+    <w:p>
+      <w:pPr>
+        <w:pStyle w:val="Heading1"/>
+      </w:pPr>
+      <w:r>
+        <w:t>（2）第2步：用角度一步步证明垂直</w:t>
+      </w:r>
+    </w:p>
+    <w:p>
+      <w:r>
+        <w:t>作图：延长BD与CE交于T；突出△BCT，令x=∠ABD。</w:t>
+      </w:r>
+    </w:p>
+    <w:p>
+      <w:r>
+        <w:drawing>
+          <wp:inline xmlns:a="http://schemas.openxmlformats.org/drawingml/2006/main" xmlns:pic="http://schemas.openxmlformats.org/drawingml/2006/picture">
+            <wp:extent cx="3780000" cy="3198462"/>
+            <wp:docPr id="21" name="Picture 21"/>
+            <wp:cNvGraphicFramePr>
+              <a:graphicFrameLocks noChangeAspect="1"/>
+            </wp:cNvGraphicFramePr>
+            <a:graphic>
+              <a:graphicData uri="http://schemas.openxmlformats.org/drawingml/2006/picture">
+                <pic:pic>
+                  <pic:nvPicPr>
+                    <pic:cNvPr id="0" name="q4angles.png"/>
+                    <pic:cNvPicPr/>
+                  </pic:nvPicPr>
+                  <pic:blipFill>
+                    <a:blip r:embed="rId30"/>
+                    <a:stretch>
+                      <a:fillRect/>
+                    </a:stretch>
+                  </pic:blipFill>
+                  <pic:spPr>
+                    <a:xfrm>
+                      <a:off x="0" y="0"/>
+                      <a:ext cx="3780000" cy="3198462"/>
+                    </a:xfrm>
+                    <a:prstGeom prst="rect"/>
+                  </pic:spPr>
+                </pic:pic>
+              </a:graphicData>
+            </a:graphic>
+          </wp:inline>
+        </w:drawing>
+      </w:r>
+    </w:p>
+    <w:p>
+      <w:r>
+        <w:t>由刚才全等，∠ACE=∠ABD=x。</w:t>
+        <w:br/>
+        <w:t>等腰直角△ABC中，∠ABC=∠BCA=45°。</w:t>
+        <w:br/>
+        <w:t>∠CBT=45°-x；</w:t>
+        <w:br/>
+        <w:t>∠BCT=45°+x。</w:t>
+        <w:br/>
+        <w:t>所以∠BTC=180°-(45°-x)-(45°+x)=90°。</w:t>
+        <w:br/>
+        <w:t>这里使用图2的点与角位置。</w:t>
+      </w:r>
+    </w:p>
+    <w:p>
+      <w:r>
+        <w:t>本步结论：BD⊥CE。“两边相等”本身不能直接推出垂直。</w:t>
+      </w:r>
+    </w:p>
+    <w:p>
+      <w:r>
+        <w:br w:type="page"/>
+      </w:r>
+    </w:p>
+    <w:p>
+      <w:pPr>
+        <w:pStyle w:val="Title"/>
+      </w:pPr>
+      <w:r>
+        <w:t>第4题：逐步图解</w:t>
+      </w:r>
+    </w:p>
+    <w:p>
+      <w:pPr>
+        <w:pStyle w:val="Heading1"/>
+      </w:pPr>
+      <w:r>
+        <w:t>（2）第3步：旋转后PM仍是中点连线</w:t>
+      </w:r>
+    </w:p>
+    <w:p>
+      <w:r>
+        <w:t>作图：旋转图中单独突出△DCE；突出DP、PC与DM、ME。</w:t>
+      </w:r>
+    </w:p>
+    <w:p>
+      <w:r>
+        <w:drawing>
+          <wp:inline xmlns:a="http://schemas.openxmlformats.org/drawingml/2006/main" xmlns:pic="http://schemas.openxmlformats.org/drawingml/2006/picture">
+            <wp:extent cx="3780000" cy="3198462"/>
+            <wp:docPr id="22" name="Picture 22"/>
+            <wp:cNvGraphicFramePr>
+              <a:graphicFrameLocks noChangeAspect="1"/>
+            </wp:cNvGraphicFramePr>
+            <a:graphic>
+              <a:graphicData uri="http://schemas.openxmlformats.org/drawingml/2006/picture">
+                <pic:pic>
+                  <pic:nvPicPr>
+                    <pic:cNvPr id="0" name="q4pm.png"/>
+                    <pic:cNvPicPr/>
+                  </pic:nvPicPr>
+                  <pic:blipFill>
+                    <a:blip r:embed="rId31"/>
+                    <a:stretch>
+                      <a:fillRect/>
+                    </a:stretch>
+                  </pic:blipFill>
+                  <pic:spPr>
+                    <a:xfrm>
+                      <a:off x="0" y="0"/>
+                      <a:ext cx="3780000" cy="3198462"/>
+                    </a:xfrm>
+                    <a:prstGeom prst="rect"/>
+                  </pic:spPr>
+                </pic:pic>
+              </a:graphicData>
+            </a:graphic>
+          </wp:inline>
+        </w:drawing>
+      </w:r>
+    </w:p>
+    <w:p>
+      <w:r>
+        <w:t>D、E的位置改变了，但P始终是DC中点，M始终是DE中点。</w:t>
+        <w:br/>
+        <w:t>因此在新位置的△DCE中，仍然有</w:t>
+        <w:br/>
+        <w:t>PM∥CE，PM=CE/2。</w:t>
+        <w:br/>
+        <w:t>不需要判断PM在图上看起来是水平还是斜着。</w:t>
+      </w:r>
+    </w:p>
+    <w:p>
+      <w:r>
+        <w:t>本步结论：旋转后依然：PM∥CE，PM=CE/2。</w:t>
+      </w:r>
+    </w:p>
+    <w:p>
+      <w:r>
+        <w:br w:type="page"/>
+      </w:r>
+    </w:p>
+    <w:p>
+      <w:pPr>
+        <w:pStyle w:val="Title"/>
+      </w:pPr>
+      <w:r>
+        <w:t>第4题：逐步图解</w:t>
+      </w:r>
+    </w:p>
+    <w:p>
+      <w:pPr>
+        <w:pStyle w:val="Heading1"/>
+      </w:pPr>
+      <w:r>
+        <w:t>（2）第4步：旋转后PN仍属于△DCB</w:t>
+      </w:r>
+    </w:p>
+    <w:p>
+      <w:r>
+        <w:t>作图：只突出△DCB及红色PN，确认P、N分别在哪两边。</w:t>
+      </w:r>
+    </w:p>
+    <w:p>
+      <w:r>
+        <w:drawing>
+          <wp:inline xmlns:a="http://schemas.openxmlformats.org/drawingml/2006/main" xmlns:pic="http://schemas.openxmlformats.org/drawingml/2006/picture">
+            <wp:extent cx="3780000" cy="3198462"/>
+            <wp:docPr id="23" name="Picture 23"/>
+            <wp:cNvGraphicFramePr>
+              <a:graphicFrameLocks noChangeAspect="1"/>
+            </wp:cNvGraphicFramePr>
+            <a:graphic>
+              <a:graphicData uri="http://schemas.openxmlformats.org/drawingml/2006/picture">
+                <pic:pic>
+                  <pic:nvPicPr>
+                    <pic:cNvPr id="0" name="q4pn.png"/>
+                    <pic:cNvPicPr/>
+                  </pic:nvPicPr>
+                  <pic:blipFill>
+                    <a:blip r:embed="rId32"/>
+                    <a:stretch>
+                      <a:fillRect/>
+                    </a:stretch>
+                  </pic:blipFill>
+                  <pic:spPr>
+                    <a:xfrm>
+                      <a:off x="0" y="0"/>
+                      <a:ext cx="3780000" cy="3198462"/>
+                    </a:xfrm>
+                    <a:prstGeom prst="rect"/>
+                  </pic:spPr>
+                </pic:pic>
+              </a:graphicData>
+            </a:graphic>
+          </wp:inline>
+        </w:drawing>
+      </w:r>
+    </w:p>
+    <w:p>
+      <w:r>
+        <w:t>P是DC中点，N是CB中点。</w:t>
+        <w:br/>
+        <w:t>所以在新位置的△DCB中，</w:t>
+        <w:br/>
+        <w:t>PN∥DB，PN=DB/2。</w:t>
+        <w:br/>
+        <w:t>两条小线段的长度与方向，分别由CE和DB决定。</w:t>
+      </w:r>
+    </w:p>
+    <w:p>
+      <w:r>
+        <w:t>本步结论：旋转后依然：PN∥DB，PN=DB/2。</w:t>
+      </w:r>
+    </w:p>
+    <w:p>
+      <w:r>
+        <w:br w:type="page"/>
+      </w:r>
+    </w:p>
+    <w:p>
+      <w:pPr>
+        <w:pStyle w:val="Title"/>
+      </w:pPr>
+      <w:r>
+        <w:t>第4题：逐步图解</w:t>
+      </w:r>
+    </w:p>
+    <w:p>
+      <w:pPr>
+        <w:pStyle w:val="Heading1"/>
+      </w:pPr>
+      <w:r>
+        <w:t>（2）第5步：合并等长、垂直两个结论</w:t>
+      </w:r>
+    </w:p>
+    <w:p>
+      <w:r>
+        <w:t>作图：突出小三角形PMN，在P处标直角。</w:t>
+      </w:r>
+    </w:p>
+    <w:p>
+      <w:r>
+        <w:drawing>
+          <wp:inline xmlns:a="http://schemas.openxmlformats.org/drawingml/2006/main" xmlns:pic="http://schemas.openxmlformats.org/drawingml/2006/picture">
+            <wp:extent cx="3780000" cy="3198462"/>
+            <wp:docPr id="24" name="Picture 24"/>
+            <wp:cNvGraphicFramePr>
+              <a:graphicFrameLocks noChangeAspect="1"/>
+            </wp:cNvGraphicFramePr>
+            <a:graphic>
+              <a:graphicData uri="http://schemas.openxmlformats.org/drawingml/2006/picture">
+                <pic:pic>
+                  <pic:nvPicPr>
+                    <pic:cNvPr id="0" name="q4result.png"/>
+                    <pic:cNvPicPr/>
+                  </pic:nvPicPr>
+                  <pic:blipFill>
+                    <a:blip r:embed="rId33"/>
+                    <a:stretch>
+                      <a:fillRect/>
+                    </a:stretch>
+                  </pic:blipFill>
+                  <pic:spPr>
+                    <a:xfrm>
+                      <a:off x="0" y="0"/>
+                      <a:ext cx="3780000" cy="3198462"/>
+                    </a:xfrm>
+                    <a:prstGeom prst="rect"/>
+                  </pic:spPr>
+                </pic:pic>
+              </a:graphicData>
+            </a:graphic>
+          </wp:inline>
+        </w:drawing>
+      </w:r>
+    </w:p>
+    <w:p>
+      <w:r>
+        <w:t>因为BD=CE，</w:t>
+        <w:br/>
+        <w:t>PM=CE/2=BD/2=PN。</w:t>
+        <w:br/>
+        <w:t>因为BD⊥CE，且PN∥BD、PM∥CE，</w:t>
+        <w:br/>
+        <w:t>所以PM⊥PN。</w:t>
+        <w:br/>
+        <w:t>PM与PN相等并互相垂直，故△PMN是等腰直角三角形。</w:t>
+      </w:r>
+    </w:p>
+    <w:p>
+      <w:r>
+        <w:t>本步结论：第（2）问：△PMN为等腰直角三角形，直角顶点为P。</w:t>
+      </w:r>
+    </w:p>
+    <w:p>
+      <w:r>
+        <w:br w:type="page"/>
+      </w:r>
+    </w:p>
+    <w:p>
+      <w:pPr>
+        <w:pStyle w:val="Title"/>
+      </w:pPr>
+      <w:r>
+        <w:t>第4题：逐步图解</w:t>
+      </w:r>
+    </w:p>
+    <w:p>
+      <w:pPr>
+        <w:pStyle w:val="Heading1"/>
+      </w:pPr>
+      <w:r>
+        <w:t>（3）第1步：先把面积写成BD的式子</w:t>
+      </w:r>
+    </w:p>
+    <w:p>
+      <w:r>
+        <w:t>作图：突出两条直角边PM、PN，各标为BD/2。</w:t>
+      </w:r>
+    </w:p>
+    <w:p>
+      <w:r>
+        <w:drawing>
+          <wp:inline xmlns:a="http://schemas.openxmlformats.org/drawingml/2006/main" xmlns:pic="http://schemas.openxmlformats.org/drawingml/2006/picture">
+            <wp:extent cx="3780000" cy="3198462"/>
+            <wp:docPr id="25" name="Picture 25"/>
+            <wp:cNvGraphicFramePr>
+              <a:graphicFrameLocks noChangeAspect="1"/>
+            </wp:cNvGraphicFramePr>
+            <a:graphic>
+              <a:graphicData uri="http://schemas.openxmlformats.org/drawingml/2006/picture">
+                <pic:pic>
+                  <pic:nvPicPr>
+                    <pic:cNvPr id="0" name="q4area.png"/>
+                    <pic:cNvPicPr/>
+                  </pic:nvPicPr>
+                  <pic:blipFill>
+                    <a:blip r:embed="rId34"/>
+                    <a:stretch>
+                      <a:fillRect/>
+                    </a:stretch>
+                  </pic:blipFill>
+                  <pic:spPr>
+                    <a:xfrm>
+                      <a:off x="0" y="0"/>
+                      <a:ext cx="3780000" cy="3198462"/>
+                    </a:xfrm>
+                    <a:prstGeom prst="rect"/>
+                  </pic:spPr>
+                </pic:pic>
+              </a:graphicData>
+            </a:graphic>
+          </wp:inline>
+        </w:drawing>
+      </w:r>
+    </w:p>
+    <w:p>
+      <w:r>
+        <w:t>自由旋转时，绕A逆时针转90°始终把B对应到C、D对应到E，所以BD与CE始终等长且垂直。</w:t>
+        <w:br/>
+        <w:t>于是PM=PN=BD/2。</w:t>
+        <w:br/>
+        <w:t>S△PMN=(1/2)×PM×PN</w:t>
+        <w:br/>
+        <w:t>=(1/2)×(BD/2)×(BD/2)</w:t>
+        <w:br/>
+        <w:t>=BD²/8。</w:t>
+      </w:r>
+    </w:p>
+    <w:p>
+      <w:r>
+        <w:t>本步结论：面积只随BD的长度改变；BD越长，面积越大。</w:t>
+      </w:r>
+    </w:p>
+    <w:p>
+      <w:r>
+        <w:br w:type="page"/>
+      </w:r>
+    </w:p>
+    <w:p>
+      <w:pPr>
+        <w:pStyle w:val="Title"/>
+      </w:pPr>
+      <w:r>
+        <w:t>第4题：逐步图解</w:t>
+      </w:r>
+    </w:p>
+    <w:p>
+      <w:pPr>
+        <w:pStyle w:val="Heading1"/>
+      </w:pPr>
+      <w:r>
+        <w:t>（3）第2步：BD最多多长？</w:t>
+      </w:r>
+    </w:p>
+    <w:p>
+      <w:r>
+        <w:t>作图：单独画B、A、D及AB=10、AD=4。</w:t>
+      </w:r>
+    </w:p>
+    <w:p>
+      <w:r>
+        <w:drawing>
+          <wp:inline xmlns:a="http://schemas.openxmlformats.org/drawingml/2006/main" xmlns:pic="http://schemas.openxmlformats.org/drawingml/2006/picture">
+            <wp:extent cx="3780000" cy="3198462"/>
+            <wp:docPr id="26" name="Picture 26"/>
+            <wp:cNvGraphicFramePr>
+              <a:graphicFrameLocks noChangeAspect="1"/>
+            </wp:cNvGraphicFramePr>
+            <a:graphic>
+              <a:graphicData uri="http://schemas.openxmlformats.org/drawingml/2006/picture">
+                <pic:pic>
+                  <pic:nvPicPr>
+                    <pic:cNvPr id="0" name="q4bound.png"/>
+                    <pic:cNvPicPr/>
+                  </pic:nvPicPr>
+                  <pic:blipFill>
+                    <a:blip r:embed="rId35"/>
+                    <a:stretch>
+                      <a:fillRect/>
+                    </a:stretch>
+                  </pic:blipFill>
+                  <pic:spPr>
+                    <a:xfrm>
+                      <a:off x="0" y="0"/>
+                      <a:ext cx="3780000" cy="3198462"/>
+                    </a:xfrm>
+                    <a:prstGeom prst="rect"/>
+                  </pic:spPr>
+                </pic:pic>
+              </a:graphicData>
+            </a:graphic>
+          </wp:inline>
+        </w:drawing>
+      </w:r>
+    </w:p>
+    <w:p>
+      <w:r>
+        <w:t>从B经过A到D是折线，BD是直接连接B、D的线段。</w:t>
+        <w:br/>
+        <w:t>因此BD≤BA+AD=10+4=14。</w:t>
+        <w:br/>
+        <w:t>一般不共线的位置严格小于14。</w:t>
+        <w:br/>
+        <w:t>要等于14，必须让B、A、D依次共线，也就是A在B与D之间。</w:t>
+      </w:r>
+    </w:p>
+    <w:p>
+      <w:r>
+        <w:t>本步结论：BD的上界为14；必须检查这个位置能否通过旋转得到。</w:t>
+      </w:r>
+    </w:p>
+    <w:p>
+      <w:r>
+        <w:br w:type="page"/>
+      </w:r>
+    </w:p>
+    <w:p>
+      <w:pPr>
+        <w:pStyle w:val="Title"/>
+      </w:pPr>
+      <w:r>
+        <w:t>第4题：逐步图解</w:t>
+      </w:r>
+    </w:p>
+    <w:p>
+      <w:pPr>
+        <w:pStyle w:val="Heading1"/>
+      </w:pPr>
+      <w:r>
+        <w:t>（3）第3步：画出达到最大值的完整位置</w:t>
+      </w:r>
+    </w:p>
+    <w:p>
+      <w:r>
+        <w:t>作图：把AD旋转到AB的反向延长线上；重画E、M、P、N。</w:t>
+      </w:r>
+    </w:p>
+    <w:p>
+      <w:r>
+        <w:drawing>
+          <wp:inline xmlns:a="http://schemas.openxmlformats.org/drawingml/2006/main" xmlns:pic="http://schemas.openxmlformats.org/drawingml/2006/picture">
+            <wp:extent cx="3780000" cy="3198462"/>
+            <wp:docPr id="27" name="Picture 27"/>
+            <wp:cNvGraphicFramePr>
+              <a:graphicFrameLocks noChangeAspect="1"/>
+            </wp:cNvGraphicFramePr>
+            <a:graphic>
+              <a:graphicData uri="http://schemas.openxmlformats.org/drawingml/2006/picture">
+                <pic:pic>
+                  <pic:nvPicPr>
+                    <pic:cNvPr id="0" name="q4max.png"/>
+                    <pic:cNvPicPr/>
+                  </pic:nvPicPr>
+                  <pic:blipFill>
+                    <a:blip r:embed="rId36"/>
+                    <a:stretch>
+                      <a:fillRect/>
+                    </a:stretch>
+                  </pic:blipFill>
+                  <pic:spPr>
+                    <a:xfrm>
+                      <a:off x="0" y="0"/>
+                      <a:ext cx="3780000" cy="3198462"/>
+                    </a:xfrm>
+                    <a:prstGeom prst="rect"/>
+                  </pic:spPr>
+                </pic:pic>
+              </a:graphicData>
+            </a:graphic>
+          </wp:inline>
+        </w:drawing>
+      </w:r>
+    </w:p>
+    <w:p>
+      <w:r>
+        <w:t>自由旋转允许D、A、B依次共线。</w:t>
+        <w:br/>
+        <w:t>此时BD=DA+AB=4+10=14。</w:t>
+        <w:br/>
+        <w:t>CE=14，PM=PN=14/2=7。</w:t>
+        <w:br/>
+        <w:t>S△PMN=(1/2)×7×7=49/2。</w:t>
+        <w:br/>
+        <w:t>图中小三角形仍然是等腰直角三角形，没有退化。</w:t>
+      </w:r>
+    </w:p>
+    <w:p>
+      <w:r>
+        <w:t>本步结论：第（3）问：最大面积49/2；D在AB的反向延长线上时取得。</w:t>
+      </w:r>
+    </w:p>
+    <w:p>
+      <w:r>
+        <w:br w:type="page"/>
+      </w:r>
+    </w:p>
+    <w:p>
+      <w:pPr>
+        <w:pStyle w:val="Title"/>
+      </w:pPr>
+      <w:r>
+        <w:t>附录：中点连线性质的全等证明</w:t>
+      </w:r>
+    </w:p>
+    <w:p>
+      <w:pPr>
+        <w:pStyle w:val="Heading1"/>
+      </w:pPr>
+      <w:r>
+        <w:t>引理第1步：延长中点连线，制造第一组全等</w:t>
+      </w:r>
+    </w:p>
+    <w:p>
+      <w:r>
+        <w:t>作图：△TUV中X、Y为TU、TV中点。延长XY至Z，使YZ=YX。</w:t>
+      </w:r>
+    </w:p>
+    <w:p>
+      <w:r>
+        <w:drawing>
+          <wp:inline xmlns:a="http://schemas.openxmlformats.org/drawingml/2006/main" xmlns:pic="http://schemas.openxmlformats.org/drawingml/2006/picture">
+            <wp:extent cx="3780000" cy="3198462"/>
+            <wp:docPr id="28" name="Picture 28"/>
+            <wp:cNvGraphicFramePr>
+              <a:graphicFrameLocks noChangeAspect="1"/>
+            </wp:cNvGraphicFramePr>
+            <a:graphic>
+              <a:graphicData uri="http://schemas.openxmlformats.org/drawingml/2006/picture">
+                <pic:pic>
+                  <pic:nvPicPr>
+                    <pic:cNvPr id="0" name="lemma1.png"/>
+                    <pic:cNvPicPr/>
+                  </pic:nvPicPr>
+                  <pic:blipFill>
+                    <a:blip r:embed="rId37"/>
+                    <a:stretch>
+                      <a:fillRect/>
+                    </a:stretch>
+                  </pic:blipFill>
+                  <pic:spPr>
+                    <a:xfrm>
+                      <a:off x="0" y="0"/>
+                      <a:ext cx="3780000" cy="3198462"/>
+                    </a:xfrm>
+                    <a:prstGeom prst="rect"/>
+                  </pic:spPr>
+                </pic:pic>
+              </a:graphicData>
+            </a:graphic>
+          </wp:inline>
+        </w:drawing>
+      </w:r>
+    </w:p>
+    <w:p>
+      <w:r>
+        <w:t>①TY=YV（Y是中点）。</w:t>
+        <w:br/>
+        <w:t>②YX=YZ（复制长度）。</w:t>
+        <w:br/>
+        <w:t>③∠TYX=∠VYZ（对顶角）。</w:t>
+        <w:br/>
+        <w:t>所以△TYX≌△VYZ（SAS）。</w:t>
+        <w:br/>
+        <w:t>对应边VZ=TX=UX；对应角∠YTX=∠YVZ，故VZ∥UX。</w:t>
+      </w:r>
+    </w:p>
+    <w:p>
+      <w:r>
+        <w:t>本步结论：VZ=UX，VZ∥UX。</w:t>
+      </w:r>
+    </w:p>
+    <w:p>
+      <w:r>
+        <w:br w:type="page"/>
+      </w:r>
+    </w:p>
+    <w:p>
+      <w:pPr>
+        <w:pStyle w:val="Title"/>
+      </w:pPr>
+      <w:r>
+        <w:t>附录：中点连线性质的全等证明</w:t>
+      </w:r>
+    </w:p>
+    <w:p>
+      <w:pPr>
+        <w:pStyle w:val="Heading1"/>
+      </w:pPr>
+      <w:r>
+        <w:t>引理第2步：连UZ，制造第二组全等</w:t>
+      </w:r>
+    </w:p>
+    <w:p>
+      <w:r>
+        <w:t>作图：连UZ，突出△XUZ与△VZU。</w:t>
+      </w:r>
+    </w:p>
+    <w:p>
+      <w:r>
+        <w:drawing>
+          <wp:inline xmlns:a="http://schemas.openxmlformats.org/drawingml/2006/main" xmlns:pic="http://schemas.openxmlformats.org/drawingml/2006/picture">
+            <wp:extent cx="3780000" cy="3198462"/>
+            <wp:docPr id="29" name="Picture 29"/>
+            <wp:cNvGraphicFramePr>
+              <a:graphicFrameLocks noChangeAspect="1"/>
+            </wp:cNvGraphicFramePr>
+            <a:graphic>
+              <a:graphicData uri="http://schemas.openxmlformats.org/drawingml/2006/picture">
+                <pic:pic>
+                  <pic:nvPicPr>
+                    <pic:cNvPr id="0" name="lemma2.png"/>
+                    <pic:cNvPicPr/>
+                  </pic:nvPicPr>
+                  <pic:blipFill>
+                    <a:blip r:embed="rId38"/>
+                    <a:stretch>
+                      <a:fillRect/>
+                    </a:stretch>
+                  </pic:blipFill>
+                  <pic:spPr>
+                    <a:xfrm>
+                      <a:off x="0" y="0"/>
+                      <a:ext cx="3780000" cy="3198462"/>
+                    </a:xfrm>
+                    <a:prstGeom prst="rect"/>
+                  </pic:spPr>
+                </pic:pic>
+              </a:graphicData>
+            </a:graphic>
+          </wp:inline>
+        </w:drawing>
+      </w:r>
+    </w:p>
+    <w:p>
+      <w:r>
+        <w:t>①UX=VZ（第1步）。</w:t>
+        <w:br/>
+        <w:t>②UZ是公共边。</w:t>
+        <w:br/>
+        <w:t>③∠XUZ=∠VZU（UX∥VZ，内错角相等）。</w:t>
+        <w:br/>
+        <w:t>所以△XUZ≌△VZU（SAS）。</w:t>
+        <w:br/>
+        <w:t>对应边XZ=VU；对应角∠XZU=∠VUZ，故XZ∥VU。</w:t>
+      </w:r>
+    </w:p>
+    <w:p>
+      <w:r>
+        <w:t>本步结论：XZ=UV，XZ∥UV。</w:t>
+      </w:r>
+    </w:p>
+    <w:p>
+      <w:r>
+        <w:br w:type="page"/>
+      </w:r>
+    </w:p>
+    <w:p>
+      <w:pPr>
+        <w:pStyle w:val="Title"/>
+      </w:pPr>
+      <w:r>
+        <w:t>附录：中点连线性质的全等证明</w:t>
+      </w:r>
+    </w:p>
+    <w:p>
+      <w:pPr>
+        <w:pStyle w:val="Heading1"/>
+      </w:pPr>
+      <w:r>
+        <w:t>引理第3步：从整段XZ回到半段XY</w:t>
+      </w:r>
+    </w:p>
+    <w:p>
+      <w:r>
+        <w:t>作图：突出原来的XY、底边UV，确认X、Y、Z的顺序。</w:t>
+      </w:r>
+    </w:p>
+    <w:p>
+      <w:r>
+        <w:drawing>
+          <wp:inline xmlns:a="http://schemas.openxmlformats.org/drawingml/2006/main" xmlns:pic="http://schemas.openxmlformats.org/drawingml/2006/picture">
+            <wp:extent cx="3780000" cy="3198462"/>
+            <wp:docPr id="30" name="Picture 30"/>
+            <wp:cNvGraphicFramePr>
+              <a:graphicFrameLocks noChangeAspect="1"/>
+            </wp:cNvGraphicFramePr>
+            <a:graphic>
+              <a:graphicData uri="http://schemas.openxmlformats.org/drawingml/2006/picture">
+                <pic:pic>
+                  <pic:nvPicPr>
+                    <pic:cNvPr id="0" name="lemma3.png"/>
+                    <pic:cNvPicPr/>
+                  </pic:nvPicPr>
+                  <pic:blipFill>
+                    <a:blip r:embed="rId39"/>
+                    <a:stretch>
+                      <a:fillRect/>
+                    </a:stretch>
+                  </pic:blipFill>
+                  <pic:spPr>
+                    <a:xfrm>
+                      <a:off x="0" y="0"/>
+                      <a:ext cx="3780000" cy="3198462"/>
+                    </a:xfrm>
+                    <a:prstGeom prst="rect"/>
+                  </pic:spPr>
+                </pic:pic>
+              </a:graphicData>
+            </a:graphic>
+          </wp:inline>
+        </w:drawing>
+      </w:r>
+    </w:p>
+    <w:p>
+      <w:r>
+        <w:t>X、Y、Z依次共线，XY=YZ。</w:t>
+        <w:br/>
+        <w:t>所以XZ=XY+YZ=2XY。</w:t>
+        <w:br/>
+        <w:t>第2步已经证明XZ=UV，因此XY=UV/2。</w:t>
+        <w:br/>
+        <w:t>XY与XZ在同一直线上，故XY∥UV。</w:t>
+      </w:r>
+    </w:p>
+    <w:p>
+      <w:r>
+        <w:t>本步结论：中点连线性质：XY∥UV，XY=UV/2。两次SAS即可证明。</w:t>
+      </w:r>
+    </w:p>
+    <w:p>
+      <w:r>
+        <w:br w:type="page"/>
+      </w:r>
+    </w:p>
+    <w:p>
+      <w:pPr>
+        <w:pStyle w:val="Title"/>
+      </w:pPr>
+      <w:r>
+        <w:t>评分与课堂回练</w:t>
       </w:r>
     </w:p>
     <w:p>
@@ -197,12 +2436,12 @@
         <w:pStyle w:val="Heading2"/>
       </w:pPr>
       <w:r>
-        <w:t>答案</w:t>
+        <w:t>第1题：8分评分与提示</w:t>
       </w:r>
     </w:p>
     <w:p>
       <w:r>
-        <w:t>运动路径是一条与AB平行的线段，长为8。只答8不能确认会做动点迁移。</w:t>
+        <w:t>AM=EN的全等2分；BM=MN及折线转化2分；固定下界2分；合法取点、顺序及等号2分。提示顺序：①哪条长度能旋转到N附近？②BMN是什么三角形？③折线的端点是否固定？④等号时M落在哪里？记录提示等级。</w:t>
       </w:r>
     </w:p>
     <w:p>
@@ -210,46 +2449,7 @@
         <w:pStyle w:val="Heading2"/>
       </w:pPr>
       <w:r>
-        <w:t>找到固定点Q</w:t>
-      </w:r>
-    </w:p>
-    <w:p>
-      <w:r>
-        <w:t>在AB同侧作固定的等边△ABQ。由等边三角形的60°角可知E在AQ上，F在BQ上，EP∥BQ。又EP=AP，FQ=BQ-BF=AB-BP=AP，所以EP=FQ。此处没有用相似比例。</w:t>
-      </w:r>
-    </w:p>
-    <w:p>
-      <w:pPr>
-        <w:pStyle w:val="Heading2"/>
-      </w:pPr>
-      <w:r>
-        <w:t>证明M是QP中点</w:t>
-      </w:r>
-    </w:p>
-    <w:p>
-      <w:r>
-        <w:t>M为EF中点，EM=FM；EP∥FQ使∠PEM=∠QFM；EP=FQ，所以△PEM≌△QFM（SAS），得PM=QM。对应角又说明PM、QM为反向共线的两条射线，故Q、M、P共线，M为QP中点。这里要同时证明共线和等长。</w:t>
-      </w:r>
-    </w:p>
-    <w:p>
-      <w:pPr>
-        <w:pStyle w:val="Heading2"/>
-      </w:pPr>
-      <w:r>
-        <w:t>再判断轨迹及长度</w:t>
-      </w:r>
-    </w:p>
-    <w:p>
-      <w:r>
-        <w:t>设H为QA中点。对任意P，△QAP中H、M为两边中点，所以HM∥AP，即M在过H且平行AB的固定直线上。P从C到D时，M分别从QC的中点K到QD的中点L。△QCD的中点连线给KL=CD/2；CD=20-2-2=16，所以KL=8。对应P的顺序保持，M沿KL单向运动，无额外折返。</w:t>
-      </w:r>
-    </w:p>
-    <w:p>
-      <w:pPr>
-        <w:pStyle w:val="Heading2"/>
-      </w:pPr>
-      <w:r>
-        <w:t>10分评分与提示</w:t>
+        <w:t>第2题：10分评分与提示</w:t>
       </w:r>
     </w:p>
     <w:p>
@@ -262,98 +2462,7 @@
         <w:pStyle w:val="Heading2"/>
       </w:pPr>
       <w:r>
-        <w:t>诊断区分</w:t>
-      </w:r>
-    </w:p>
-    <w:p>
-      <w:r>
-        <w:t>若给出Q后能独立证明，主要卡在辅助线选择；若已指出M是QP中点仍无法描述轨迹，主要卡在固定点和动点关系；若中点连线性质未学，先补引理，再观察能否自行接上。</w:t>
-      </w:r>
-    </w:p>
-    <w:p>
-      <w:r>
-        <w:br w:type="page"/>
-      </w:r>
-    </w:p>
-    <w:p>
-      <w:pPr>
-        <w:pStyle w:val="Title"/>
-      </w:pPr>
-      <w:r>
-        <w:t>第3题：同一辅助线，关系由加变减</w:t>
-      </w:r>
-    </w:p>
-    <w:p>
-      <w:pPr>
-        <w:pStyle w:val="Heading2"/>
-      </w:pPr>
-      <w:r>
-        <w:t>答案</w:t>
-      </w:r>
-    </w:p>
-    <w:p>
-      <w:r>
-        <w:t>（1）EF=BE+DF。（2）仍成立。（3）BE=DF+EF，亦即EF=BE-DF。第（3）问不能照搬前两问的加法关系。</w:t>
-      </w:r>
-    </w:p>
-    <w:p>
-      <w:pPr>
-        <w:pStyle w:val="Heading2"/>
-      </w:pPr>
-      <w:r>
-        <w:t>第（1）（2）问：第一次全等</w:t>
-      </w:r>
-    </w:p>
-    <w:p>
-      <w:r>
-        <w:t>沿CB过B延长到G，使BG=DF。由∠ABG=180°-∠ABC=∠ADC=∠ADF，AB=AD，BG=DF，得△ABG≌△ADF（SAS）。于是AG=AF，∠BAG=∠DAF。正方形是这一论证的特殊情形。</w:t>
-      </w:r>
-    </w:p>
-    <w:p>
-      <w:pPr>
-        <w:pStyle w:val="Heading2"/>
-      </w:pPr>
-      <w:r>
-        <w:t>第二次全等与加法</w:t>
-      </w:r>
-    </w:p>
-    <w:p>
-      <w:r>
-        <w:t>图1、2中，∠GAE=∠GAB+∠BAE=∠DAF+∠BAE=∠BAD-∠EAF=∠EAF。又AG=AF，AE公共，故△GAE≌△FAE（SAS），得到GE=FE。此时G、B、E依次共线，所以GE=GB+BE=DF+BE。</w:t>
-      </w:r>
-    </w:p>
-    <w:p>
-      <w:pPr>
-        <w:pStyle w:val="Heading2"/>
-      </w:pPr>
-      <w:r>
-        <w:t>第（3）问：改变复制长度的位置</w:t>
-      </w:r>
-    </w:p>
-    <w:p>
-      <w:r>
-        <w:t>这次在射线BC上取G，使BG=DF。F在CD越过D的延长线上，∠ADF=180°-∠ADC=∠ABC=∠ABG。由AB=AD、BG=DF，仍有△ABG≌△ADF（SAS），AG=AF，∠BAG=∠DAF。</w:t>
-      </w:r>
-    </w:p>
-    <w:p>
-      <w:pPr>
-        <w:pStyle w:val="Heading2"/>
-      </w:pPr>
-      <w:r>
-        <w:t>第二次全等与减法</w:t>
-      </w:r>
-    </w:p>
-    <w:p>
-      <w:r>
-        <w:t>图3中，∠BAE=∠EAF+∠DAF。因此∠GAE=∠BAE-∠BAG=∠EAF，结合AG=AF、AE公共，得△GAE≌△FAE（SAS），GE=EF。因为0&lt;∠BAG=∠DAF&lt;∠BAE，射线AG在∠BAE内部，它与BE相交于G，故B、G、E依次共线。于是GE=BE-BG=BE-DF，得到BE=DF+EF。</w:t>
-      </w:r>
-    </w:p>
-    <w:p>
-      <w:pPr>
-        <w:pStyle w:val="Heading2"/>
-      </w:pPr>
-      <w:r>
-        <w:t>20分评分与提示</w:t>
+        <w:t>第3题：20分评分与提示</w:t>
       </w:r>
     </w:p>
     <w:p>
@@ -366,142 +2475,12 @@
         <w:pStyle w:val="Heading2"/>
       </w:pPr>
       <w:r>
-        <w:t>对应原卷的能力</w:t>
-      </w:r>
-    </w:p>
-    <w:p>
-      <w:r>
-        <w:t>这题保留了“基本位置—条件推广—图形换位置”的层次，接近原卷第24、25题的后续小问。关键是每换一次位置，都重新检查夹角和线段顺序。不要只背“半角模型等于和”。</w:t>
-      </w:r>
-    </w:p>
-    <w:p>
-      <w:r>
-        <w:br w:type="page"/>
-      </w:r>
-    </w:p>
-    <w:p>
-      <w:pPr>
-        <w:pStyle w:val="Title"/>
-      </w:pPr>
-      <w:r>
-        <w:t>第4题：旋转等长垂直，再连接中点</w:t>
-      </w:r>
-    </w:p>
-    <w:p>
-      <w:pPr>
-        <w:pStyle w:val="Heading2"/>
-      </w:pPr>
-      <w:r>
-        <w:t>答案</w:t>
-      </w:r>
-    </w:p>
-    <w:p>
-      <w:r>
-        <w:t>（1）PM=PN，PM⊥PN。（2）△PMN为等腰直角三角形，直角顶点为P。（3）最大面积49/2，D在射线AB的反向延长线上，即D、A、B依次共线时取得。</w:t>
-      </w:r>
-    </w:p>
-    <w:p>
-      <w:pPr>
-        <w:pStyle w:val="Heading2"/>
-      </w:pPr>
-      <w:r>
-        <w:t>长度与方向先来自哪里</w:t>
-      </w:r>
-    </w:p>
-    <w:p>
-      <w:r>
-        <w:t>将平面绕A逆时针旋转90°，B恰好转到C，D恰好转到E，因此线段BD转到CE。得到BD=CE且BD⊥CE。对图2也可先说明∠BAD=∠CAE，AB=AC、AD=AE，从△BAD≌△CAE（SAS）得BD=CE；90°旋转同时确定对应线段的方向。两组三角形必须同向旋转，不能只看到两个直角就猜结论。</w:t>
-      </w:r>
-    </w:p>
-    <w:p>
-      <w:pPr>
-        <w:pStyle w:val="Heading2"/>
-      </w:pPr>
-      <w:r>
-        <w:t>把结论搬到PM、PN</w:t>
-      </w:r>
-    </w:p>
-    <w:p>
-      <w:r>
-        <w:t>在△DCE中，P、M分别为DC、DE中点，所以PM∥CE，PM=CE/2；在△DCB中，P、N分别为DC、CB中点，所以PN∥DB，PN=DB/2。结合BD=CE、BD⊥CE，得到PM=PN、PM⊥PN。所以△PMN为等腰直角三角形。这些中点结论若未学，先看下一页证明。</w:t>
-      </w:r>
-    </w:p>
-    <w:p>
-      <w:pPr>
-        <w:pStyle w:val="Heading2"/>
-      </w:pPr>
-      <w:r>
-        <w:t>面积为何有固定上界</w:t>
-      </w:r>
-    </w:p>
-    <w:p>
-      <w:r>
-        <w:t>自由旋转时，等长和垂直关系仍成立，故S△PMN=(1/2)PM·PN=BD²/8。三角形不等式给BD≤AB+AD=14，所以面积≤14²/8=49/2。等号在D、A、B依次共线时成立；自由旋转允许这一位置，所以是可取得的最大值。不能只列出14而不说明旋转能否到达。</w:t>
-      </w:r>
-    </w:p>
-    <w:p>
-      <w:pPr>
-        <w:pStyle w:val="Heading2"/>
-      </w:pPr>
-      <w:r>
-        <w:t>退化位置须说明</w:t>
-      </w:r>
-    </w:p>
-    <w:p>
-      <w:r>
-        <w:t>BD=0不可能，因为AB=10、AD=4。个别旋转位置可能使C、D、E或C、D、B共线，但其中点平行和半长关系直接由共线线段成立，或由旋转连续性得到；不影响该题最大值。计算最大值的D、A、B共线位置下△PMN并不退化。</w:t>
-      </w:r>
-    </w:p>
-    <w:p>
-      <w:pPr>
-        <w:pStyle w:val="Heading2"/>
-      </w:pPr>
-      <w:r>
-        <w:t>22分评分与提示</w:t>
+        <w:t>第4题：22分评分与提示</w:t>
       </w:r>
     </w:p>
     <w:p>
       <w:r>
         <w:t>（1）两关系各2分。（2）BD=CE的全等或明确旋转理由4分；BD⊥CE的方向理由2分；两条中点连线4分；等腰直角结论2分。（3）面积化为BD²/8得2分；上界及49/2得2分；合法取等位置2分。</w:t>
-      </w:r>
-    </w:p>
-    <w:p>
-      <w:pPr>
-        <w:pStyle w:val="Heading2"/>
-      </w:pPr>
-      <w:r>
-        <w:t>防止机械套用</w:t>
-      </w:r>
-    </w:p>
-    <w:p>
-      <w:r>
-        <w:t>只写“中点所以一半”而说不出是哪两个三角形，说明结构识别不足；只证明等长但没证明垂直，说明还没把旋转方向与对应角结合；只写49/2而不知道D的位置，说明最值等号仍需补课。</w:t>
-      </w:r>
-    </w:p>
-    <w:p>
-      <w:r>
-        <w:br w:type="page"/>
-      </w:r>
-    </w:p>
-    <w:p>
-      <w:pPr>
-        <w:pStyle w:val="Title"/>
-      </w:pPr>
-      <w:r>
-        <w:t>中点引理、课堂回练与出处核对</w:t>
-      </w:r>
-    </w:p>
-    <w:p>
-      <w:pPr>
-        <w:pStyle w:val="Heading2"/>
-      </w:pPr>
-      <w:r>
-        <w:t>中点连线引理：用两次SAS补齐</w:t>
-      </w:r>
-    </w:p>
-    <w:p>
-      <w:r>
-        <w:t>△TUV中，X、Y分别为TU、TV中点。延长XY至Z，使YZ=YX。由TY=YV、YX=YZ及对顶角，△TYX≌△VYZ（SAS），故VZ=TX=UX，且VZ∥UX。再由UX=VZ、UZ公共、∠XUZ=∠VZU，△XUZ≌△VZU（SAS），所以XZ=VU，且XZ∥VU。因XZ=2XY，得XY∥UV、XY=UV/2。先让孩子自己写两组全等式，再应用于第2、4题。</w:t>
       </w:r>
     </w:p>
     <w:p>
@@ -580,7 +2559,7 @@
       <w:pStyle w:val="Footer"/>
     </w:pPr>
     <w:r>
-      <w:t>现有题选编｜出处、改动及许可见README｜2026-10-11</w:t>
+      <w:t>逐步教学图与辅助线｜2026-10-13更新｜原题出处见README</w:t>
     </w:r>
   </w:p>
 </w:ftr>
@@ -954,7 +2933,7 @@
     </w:pPr>
     <w:rPr>
       <w:rFonts w:ascii="宋体" w:hAnsi="宋体" w:eastAsia="宋体"/>
-      <w:sz w:val="21"/>
+      <w:sz w:val="20"/>
     </w:rPr>
   </w:style>
   <w:style w:type="paragraph" w:styleId="Header">

</xml_diff>